<commit_message>
docs(intake): M3-03, M3-04 표 정리
- 머리행이 "표현" 이라 무엇을 적는 칸인지 안 드러났다
    M3-03  화나도 쓰지 않는 말
    M3-04  웃음소리·감탄사
- 빈 칸에 따옴표만 덩그러니 있던 것(| " " |)을 비웠다
- M3-04 의 "감탄사 거의 없음" 체크가 표 아래에 떠 있어 표 위로 올렸다.
  신금자 답에서는 그 체크가 표 행으로 새어 들어가 있었다
- 한 열짜리 표에서 답의 머리행을 미리 걷어내는 바람에 내용 열을 못 찾고
  "가족 전언"(출처) 을 옮기던 버그 수정
</commit_message>
<xml_diff>
--- a/ai/docs/Persona_Intake.docx
+++ b/ai/docs/Persona_Intake.docx
@@ -2013,14 +2013,6 @@
             <w:pPr>
               <w:spacing w:after="60"/>
             </w:pPr>
-            <w:r>
-              <w:rPr>
-                <w:b w:val="0"/>
-                <w:color w:val="1A1A1A"/>
-                <w:sz w:val="18"/>
-              </w:rPr>
-              <w:t>" "</w:t>
-            </w:r>
           </w:p>
         </w:tc>
         <w:tc>
@@ -2066,14 +2058,6 @@
             <w:pPr>
               <w:spacing w:after="60"/>
             </w:pPr>
-            <w:r>
-              <w:rPr>
-                <w:b w:val="0"/>
-                <w:color w:val="1A1A1A"/>
-                <w:sz w:val="18"/>
-              </w:rPr>
-              <w:t>" "</w:t>
-            </w:r>
           </w:p>
         </w:tc>
         <w:tc>
@@ -2119,14 +2103,6 @@
             <w:pPr>
               <w:spacing w:after="60"/>
             </w:pPr>
-            <w:r>
-              <w:rPr>
-                <w:b w:val="0"/>
-                <w:color w:val="1A1A1A"/>
-                <w:sz w:val="18"/>
-              </w:rPr>
-              <w:t>" "</w:t>
-            </w:r>
           </w:p>
         </w:tc>
         <w:tc>
@@ -4679,7 +4655,7 @@
           <w:color w:val="1A1A1A"/>
           <w:sz w:val="20"/>
         </w:rPr>
-        <w:t>화나도 절대 쓰지 않는 말 (선택):</w:t>
+        <w:t>화나도 절대 쓰지 않는 말이 있으면 적어주세요. (선택, 한 줄에 하나씩)</w:t>
       </w:r>
     </w:p>
     <w:tbl>
@@ -4713,7 +4689,7 @@
                 <w:color w:val="1A1A1A"/>
                 <w:sz w:val="17"/>
               </w:rPr>
-              <w:t>표현</w:t>
+              <w:t>화나도 쓰지 않는 말</w:t>
             </w:r>
           </w:p>
         </w:tc>
@@ -4730,14 +4706,21 @@
             <w:pPr>
               <w:spacing w:after="60"/>
             </w:pPr>
-            <w:r>
-              <w:rPr>
-                <w:b w:val="0"/>
-                <w:color w:val="1A1A1A"/>
-                <w:sz w:val="18"/>
-              </w:rPr>
-              <w:t>" "</w:t>
-            </w:r>
+          </w:p>
+        </w:tc>
+      </w:tr>
+      <w:tr>
+        <w:trPr>
+          <w:cantSplit/>
+        </w:trPr>
+        <w:tc>
+          <w:tcPr>
+            <w:tcW w:type="dxa" w:w="9865"/>
+          </w:tcPr>
+          <w:p>
+            <w:pPr>
+              <w:spacing w:after="60"/>
+            </w:pPr>
           </w:p>
         </w:tc>
       </w:tr>
@@ -4794,6 +4777,22 @@
           <w:sz w:val="17"/>
         </w:rPr>
         <w:t>예: "아유" / "정말" / "굉장히"</w:t>
+      </w:r>
+    </w:p>
+    <w:p>
+      <w:pPr>
+        <w:keepNext/>
+        <w:keepLines/>
+        <w:spacing w:before="0" w:after="80" w:line="312" w:lineRule="auto"/>
+        <w:ind w:left="227"/>
+      </w:pPr>
+      <w:r>
+        <w:rPr>
+          <w:b w:val="0"/>
+          <w:color w:val="1A1A1A"/>
+          <w:sz w:val="20"/>
+        </w:rPr>
+        <w:t>□ 감탄사가 거의 없어요</w:t>
       </w:r>
     </w:p>
     <w:tbl>
@@ -4827,7 +4826,7 @@
                 <w:color w:val="1A1A1A"/>
                 <w:sz w:val="17"/>
               </w:rPr>
-              <w:t>표현</w:t>
+              <w:t>웃음소리·감탄사</w:t>
             </w:r>
           </w:p>
         </w:tc>
@@ -4844,21 +4843,28 @@
             <w:pPr>
               <w:spacing w:after="60"/>
             </w:pPr>
-            <w:r>
-              <w:rPr>
-                <w:b w:val="0"/>
-                <w:color w:val="1A1A1A"/>
-                <w:sz w:val="18"/>
-              </w:rPr>
-              <w:t>" "</w:t>
-            </w:r>
+          </w:p>
+        </w:tc>
+      </w:tr>
+      <w:tr>
+        <w:trPr>
+          <w:cantSplit/>
+        </w:trPr>
+        <w:tc>
+          <w:tcPr>
+            <w:tcW w:type="dxa" w:w="9865"/>
+          </w:tcPr>
+          <w:p>
+            <w:pPr>
+              <w:spacing w:after="60"/>
+            </w:pPr>
           </w:p>
         </w:tc>
       </w:tr>
     </w:tbl>
     <w:p>
       <w:pPr>
-        <w:keepNext/>
+        <w:keepNext w:val="0"/>
         <w:keepLines/>
         <w:spacing w:after="0"/>
       </w:pPr>
@@ -4866,22 +4872,6 @@
         <w:rPr>
           <w:sz w:val="2"/>
         </w:rPr>
-      </w:r>
-    </w:p>
-    <w:p>
-      <w:pPr>
-        <w:keepNext w:val="0"/>
-        <w:keepLines/>
-        <w:spacing w:before="0" w:after="80" w:line="312" w:lineRule="auto"/>
-        <w:ind w:left="227"/>
-      </w:pPr>
-      <w:r>
-        <w:rPr>
-          <w:b w:val="0"/>
-          <w:color w:val="1A1A1A"/>
-          <w:sz w:val="20"/>
-        </w:rPr>
-        <w:t>□ 감탄사 거의 없음</w:t>
       </w:r>
     </w:p>
     <w:p>
@@ -5578,14 +5568,6 @@
             <w:pPr>
               <w:spacing w:after="60"/>
             </w:pPr>
-            <w:r>
-              <w:rPr>
-                <w:b w:val="0"/>
-                <w:color w:val="1A1A1A"/>
-                <w:sz w:val="18"/>
-              </w:rPr>
-              <w:t>" "</w:t>
-            </w:r>
           </w:p>
         </w:tc>
         <w:tc>

</xml_diff>

<commit_message>
docs(intake): Persona Intake 형식 통일 및 M7 문항화
- 하위질문을 문장체로 통일하고 남색 + 회색 형식코드로 표시
- 형식코드 없던 18문항 채우고, 연도 칸은 단답 10자로 통일
- M7 을 필드 설명표에서 표 문항으로 바꿔 답 24행(신금자 15 · 이준혁 9) 병합
- M5 확실성 제거, M4-07 모름 체크박스, T1-01 단순화
- 답 칸으로 새던 편집 메모와 확인 필요 표기 제거
- 고르기 열의 선지 밖 값 정리, C-09 누구에게 를 자유 기입으로
- 모듈 제목이 페이지 끝에 혼자 남지 않게 다음 내용과 묶음
</commit_message>
<xml_diff>
--- a/ai/docs/Persona_Intake.docx
+++ b/ai/docs/Persona_Intake.docx
@@ -1937,7 +1937,7 @@
                 <w:color w:val="6E6E6E"/>
                 <w:sz w:val="15"/>
               </w:rPr>
-              <w:t>하나 고르기</w:t>
+              <w:t>단답 20자</w:t>
             </w:r>
             <w:r>
               <w:br/>
@@ -1947,7 +1947,7 @@
                 <w:color w:val="6E6E6E"/>
                 <w:sz w:val="15"/>
               </w:rPr>
-              <w:t>가족 중 한 사람 / 모두에게</w:t>
+              <w:t>예: 모두에게 / 며느리</w:t>
             </w:r>
           </w:p>
         </w:tc>
@@ -2329,10 +2329,17 @@
       <w:r>
         <w:rPr>
           <w:b w:val="0"/>
-          <w:color w:val="1A1A1A"/>
+          <w:color w:val="1F4E79"/>
           <w:sz w:val="20"/>
         </w:rPr>
-        <w:t>위에 없는 것이 있으면 한 줄에 하나씩 (0~5행):</w:t>
+        <w:t xml:space="preserve">위에 없는 것이 있으면 한 줄에 하나씩 적어주세요.  </w:t>
+      </w:r>
+      <w:r>
+        <w:rPr>
+          <w:color w:val="6E6E6E"/>
+          <w:sz w:val="17"/>
+        </w:rPr>
+        <w:t>표 0~5행 · 선택</w:t>
       </w:r>
     </w:p>
     <w:tbl>
@@ -2490,7 +2497,7 @@
     </w:p>
     <w:p>
       <w:pPr>
-        <w:keepNext w:val="0"/>
+        <w:keepNext/>
         <w:keepLines/>
         <w:spacing w:before="600" w:after="160" w:line="312" w:lineRule="auto"/>
         <w:ind w:left="0"/>
@@ -2532,7 +2539,7 @@
           <w:color w:val="6E6E6E"/>
           <w:sz w:val="17"/>
         </w:rPr>
-        <w:t xml:space="preserve">   숫자</w:t>
+        <w:t xml:space="preserve">   단답 10자</w:t>
       </w:r>
     </w:p>
     <w:p>
@@ -2910,7 +2917,7 @@
                 <w:color w:val="6E6E6E"/>
                 <w:sz w:val="15"/>
               </w:rPr>
-              <w:t>숫자</w:t>
+              <w:t>단답 10자</w:t>
             </w:r>
           </w:p>
         </w:tc>
@@ -2939,7 +2946,7 @@
                 <w:color w:val="6E6E6E"/>
                 <w:sz w:val="15"/>
               </w:rPr>
-              <w:t>숫자</w:t>
+              <w:t>단답 10자</w:t>
             </w:r>
           </w:p>
         </w:tc>
@@ -3391,7 +3398,7 @@
     </w:p>
     <w:p>
       <w:pPr>
-        <w:keepNext w:val="0"/>
+        <w:keepNext/>
         <w:keepLines/>
         <w:spacing w:before="0" w:after="60" w:line="312" w:lineRule="auto"/>
         <w:ind w:left="340"/>
@@ -4356,7 +4363,7 @@
     </w:p>
     <w:p>
       <w:pPr>
-        <w:keepNext w:val="0"/>
+        <w:keepNext/>
         <w:keepLines/>
         <w:spacing w:before="600" w:after="160" w:line="312" w:lineRule="auto"/>
         <w:ind w:left="0"/>
@@ -4886,10 +4893,17 @@
       <w:r>
         <w:rPr>
           <w:b w:val="0"/>
-          <w:color w:val="1A1A1A"/>
+          <w:color w:val="1F4E79"/>
           <w:sz w:val="20"/>
         </w:rPr>
-        <w:t>위에 없는 것이 있으면 한 줄에 하나씩 (0~5행):</w:t>
+        <w:t xml:space="preserve">위에 없는 것이 있으면 한 줄에 하나씩 적어주세요.  </w:t>
+      </w:r>
+      <w:r>
+        <w:rPr>
+          <w:color w:val="6E6E6E"/>
+          <w:sz w:val="17"/>
+        </w:rPr>
+        <w:t>표 0~5행 · 선택</w:t>
       </w:r>
     </w:p>
     <w:tbl>
@@ -4958,7 +4972,7 @@
     </w:p>
     <w:p>
       <w:pPr>
-        <w:keepNext w:val="0"/>
+        <w:keepNext/>
         <w:keepLines/>
         <w:spacing w:before="600" w:after="160" w:line="312" w:lineRule="auto"/>
         <w:ind w:left="0"/>
@@ -5064,7 +5078,176 @@
           <w:color w:val="1A1A1A"/>
           <w:sz w:val="20"/>
         </w:rPr>
-        <w:t>□ 직접 입력 → ____________________ (최대 2)</w:t>
+        <w:t>□ 직접 입력 → ____________________</w:t>
+      </w:r>
+    </w:p>
+    <w:p>
+      <w:pPr>
+        <w:keepNext/>
+        <w:keepLines/>
+        <w:spacing w:before="0" w:after="80" w:line="312" w:lineRule="auto"/>
+        <w:ind w:left="227"/>
+      </w:pPr>
+      <w:r>
+        <w:rPr>
+          <w:b w:val="0"/>
+          <w:color w:val="1F4E79"/>
+          <w:sz w:val="20"/>
+        </w:rPr>
+        <w:t xml:space="preserve">골라준 말 중 하나에 얽힌 일화가 있으면 적어주세요.  </w:t>
+      </w:r>
+      <w:r>
+        <w:rPr>
+          <w:color w:val="6E6E6E"/>
+          <w:sz w:val="17"/>
+        </w:rPr>
+        <w:t>서술 1~3문장 · 선택</w:t>
+      </w:r>
+    </w:p>
+    <w:p>
+      <w:pPr>
+        <w:spacing w:before="0" w:after="120" w:line="276" w:lineRule="auto"/>
+        <w:ind w:left="227"/>
+        <w:keepNext w:val="0"/>
+        <w:keepLines/>
+        <w:pBdr>
+          <w:bottom w:val="single" w:sz="6" w:space="4" w:color="9A9A9A"/>
+        </w:pBdr>
+      </w:pPr>
+      <w:r>
+        <w:rPr>
+          <w:sz w:val="20"/>
+        </w:rPr>
+        <w:t xml:space="preserve"> </w:t>
+      </w:r>
+    </w:p>
+    <w:p>
+      <w:pPr>
+        <w:spacing w:before="300" w:after="100" w:line="300" w:lineRule="auto"/>
+        <w:ind w:left="113" w:right="113"/>
+        <w:keepNext/>
+        <w:keepLines/>
+        <w:shd w:val="clear" w:fill="F1F5F9"/>
+      </w:pPr>
+      <w:r>
+        <w:rPr>
+          <w:b/>
+          <w:sz w:val="21"/>
+        </w:rPr>
+        <w:t xml:space="preserve">M4-02  </w:t>
+      </w:r>
+      <w:r>
+        <w:rPr>
+          <w:b/>
+          <w:color w:val="1A1A1A"/>
+          <w:sz w:val="21"/>
+        </w:rPr>
+        <w:t>인생에서 가장 중요하게 여기는 것은?</w:t>
+      </w:r>
+      <w:r>
+        <w:rPr>
+          <w:color w:val="6E6E6E"/>
+          <w:sz w:val="17"/>
+        </w:rPr>
+        <w:t xml:space="preserve">   단답 40자 · 최대 2개</w:t>
+      </w:r>
+      <w:r>
+        <w:br/>
+      </w:r>
+      <w:r>
+        <w:rPr>
+          <w:b w:val="0"/>
+          <w:color w:val="B03A2B"/>
+          <w:sz w:val="17"/>
+        </w:rPr>
+        <w:t>예: "가족 화목" / "정직"</w:t>
+      </w:r>
+      <w:r>
+        <w:br/>
+      </w:r>
+      <w:r>
+        <w:rPr>
+          <w:b w:val="0"/>
+          <w:color w:val="6E6E6E"/>
+          <w:sz w:val="17"/>
+        </w:rPr>
+        <w:t>가이드: 단어나 구 단위로 적어주세요.</w:t>
+      </w:r>
+    </w:p>
+    <w:p>
+      <w:pPr>
+        <w:spacing w:before="0" w:after="120" w:line="276" w:lineRule="auto"/>
+        <w:ind w:left="227"/>
+        <w:keepNext/>
+        <w:keepLines/>
+        <w:pBdr>
+          <w:bottom w:val="single" w:sz="6" w:space="4" w:color="9A9A9A"/>
+        </w:pBdr>
+      </w:pPr>
+      <w:r>
+        <w:rPr>
+          <w:sz w:val="20"/>
+        </w:rPr>
+        <w:t xml:space="preserve"> </w:t>
+      </w:r>
+    </w:p>
+    <w:p>
+      <w:pPr>
+        <w:spacing w:before="0" w:after="120" w:line="276" w:lineRule="auto"/>
+        <w:ind w:left="227"/>
+        <w:keepNext w:val="0"/>
+        <w:keepLines/>
+        <w:pBdr>
+          <w:bottom w:val="single" w:sz="6" w:space="4" w:color="9A9A9A"/>
+        </w:pBdr>
+      </w:pPr>
+      <w:r>
+        <w:rPr>
+          <w:sz w:val="20"/>
+        </w:rPr>
+        <w:t xml:space="preserve"> </w:t>
+      </w:r>
+    </w:p>
+    <w:p>
+      <w:pPr>
+        <w:spacing w:before="300" w:after="100" w:line="300" w:lineRule="auto"/>
+        <w:ind w:left="113" w:right="113"/>
+        <w:keepNext/>
+        <w:keepLines/>
+        <w:shd w:val="clear" w:fill="F1F5F9"/>
+      </w:pPr>
+      <w:r>
+        <w:rPr>
+          <w:b/>
+          <w:sz w:val="21"/>
+        </w:rPr>
+        <w:t xml:space="preserve">M4-03  </w:t>
+      </w:r>
+      <w:r>
+        <w:rPr>
+          <w:b/>
+          <w:color w:val="1A1A1A"/>
+          <w:sz w:val="21"/>
+        </w:rPr>
+        <w:t>돈에 대해서는 어떤 편이셨나요?</w:t>
+      </w:r>
+      <w:r>
+        <w:rPr>
+          <w:color w:val="6E6E6E"/>
+          <w:sz w:val="17"/>
+        </w:rPr>
+        <w:t xml:space="preserve">   하나 선택 + 단답 40자</w:t>
+      </w:r>
+      <w:r>
+        <w:br/>
+      </w:r>
+      <w:r>
+        <w:rPr>
+          <w:b w:val="0"/>
+          <w:color w:val="B03A2B"/>
+          <w:sz w:val="17"/>
+        </w:rPr>
+        <w:t>예: "손주 용돈"</w:t>
       </w:r>
     </w:p>
     <w:p>
@@ -5080,7 +5263,30 @@
           <w:color w:val="1A1A1A"/>
           <w:sz w:val="20"/>
         </w:rPr>
-        <w:t>골라준 말 중 하나에 얽힌 일화가 있으면 적어주세요. (선택, 1~3문장)</w:t>
+        <w:t>□ 아끼는 편  □ 쓰는 편  □ 남에게는 후하고 본인에게는 아낌  □ 무심한 편  □ 모름</w:t>
+      </w:r>
+    </w:p>
+    <w:p>
+      <w:pPr>
+        <w:keepNext/>
+        <w:keepLines/>
+        <w:spacing w:before="0" w:after="80" w:line="312" w:lineRule="auto"/>
+        <w:ind w:left="227"/>
+      </w:pPr>
+      <w:r>
+        <w:rPr>
+          <w:b w:val="0"/>
+          <w:color w:val="1F4E79"/>
+          <w:sz w:val="20"/>
+        </w:rPr>
+        <w:t xml:space="preserve">아까워하지 않던 것이 있으면 하나 적어주세요.  </w:t>
+      </w:r>
+      <w:r>
+        <w:rPr>
+          <w:color w:val="6E6E6E"/>
+          <w:sz w:val="17"/>
+        </w:rPr>
+        <w:t>단답 40자 · 선택</w:t>
       </w:r>
     </w:p>
     <w:p>
@@ -5098,138 +5304,6 @@
           <w:sz w:val="20"/>
         </w:rPr>
         <w:t xml:space="preserve"> </w:t>
-      </w:r>
-    </w:p>
-    <w:p>
-      <w:pPr>
-        <w:spacing w:before="300" w:after="100" w:line="300" w:lineRule="auto"/>
-        <w:ind w:left="113" w:right="113"/>
-        <w:keepNext/>
-        <w:keepLines/>
-        <w:shd w:val="clear" w:fill="F1F5F9"/>
-      </w:pPr>
-      <w:r>
-        <w:rPr>
-          <w:b/>
-          <w:sz w:val="21"/>
-        </w:rPr>
-        <w:t xml:space="preserve">M4-02  </w:t>
-      </w:r>
-      <w:r>
-        <w:rPr>
-          <w:b/>
-          <w:color w:val="1A1A1A"/>
-          <w:sz w:val="21"/>
-        </w:rPr>
-        <w:t>인생에서 가장 중요하게 여기는 것은?</w:t>
-      </w:r>
-      <w:r>
-        <w:rPr>
-          <w:color w:val="6E6E6E"/>
-          <w:sz w:val="17"/>
-        </w:rPr>
-        <w:t xml:space="preserve">   단답 40자 · 최대 2개</w:t>
-      </w:r>
-      <w:r>
-        <w:br/>
-      </w:r>
-      <w:r>
-        <w:rPr>
-          <w:b w:val="0"/>
-          <w:color w:val="B03A2B"/>
-          <w:sz w:val="17"/>
-        </w:rPr>
-        <w:t>예: "가족 화목" / "정직"</w:t>
-      </w:r>
-      <w:r>
-        <w:br/>
-      </w:r>
-      <w:r>
-        <w:rPr>
-          <w:b w:val="0"/>
-          <w:color w:val="6E6E6E"/>
-          <w:sz w:val="17"/>
-        </w:rPr>
-        <w:t>가이드: 단어나 구 단위로 적어주세요.</w:t>
-      </w:r>
-    </w:p>
-    <w:p>
-      <w:pPr>
-        <w:keepNext w:val="0"/>
-        <w:keepLines/>
-        <w:spacing w:before="0" w:after="80" w:line="312" w:lineRule="auto"/>
-        <w:ind w:left="227"/>
-      </w:pPr>
-      <w:r>
-        <w:rPr>
-          <w:b w:val="0"/>
-          <w:color w:val="1A1A1A"/>
-          <w:sz w:val="20"/>
-        </w:rPr>
-        <w:t>① ____________________  ② ____________________</w:t>
-      </w:r>
-    </w:p>
-    <w:p>
-      <w:pPr>
-        <w:spacing w:before="300" w:after="100" w:line="300" w:lineRule="auto"/>
-        <w:ind w:left="113" w:right="113"/>
-        <w:keepNext/>
-        <w:keepLines/>
-        <w:shd w:val="clear" w:fill="F1F5F9"/>
-      </w:pPr>
-      <w:r>
-        <w:rPr>
-          <w:b/>
-          <w:sz w:val="21"/>
-        </w:rPr>
-        <w:t xml:space="preserve">M4-03  </w:t>
-      </w:r>
-      <w:r>
-        <w:rPr>
-          <w:b/>
-          <w:color w:val="1A1A1A"/>
-          <w:sz w:val="21"/>
-        </w:rPr>
-        <w:t>돈에 대해서는 어떤 편이셨나요?</w:t>
-      </w:r>
-      <w:r>
-        <w:rPr>
-          <w:color w:val="6E6E6E"/>
-          <w:sz w:val="17"/>
-        </w:rPr>
-        <w:t xml:space="preserve">   하나 선택 + 단답 40자</w:t>
-      </w:r>
-    </w:p>
-    <w:p>
-      <w:pPr>
-        <w:keepNext/>
-        <w:keepLines/>
-        <w:spacing w:before="0" w:after="80" w:line="312" w:lineRule="auto"/>
-        <w:ind w:left="227"/>
-      </w:pPr>
-      <w:r>
-        <w:rPr>
-          <w:b w:val="0"/>
-          <w:color w:val="1A1A1A"/>
-          <w:sz w:val="20"/>
-        </w:rPr>
-        <w:t>□ 아끼는 편  □ 쓰는 편  □ 남에게는 후하고 본인에게는 아낌  □ 무심한 편  □ 모름</w:t>
-      </w:r>
-    </w:p>
-    <w:p>
-      <w:pPr>
-        <w:keepNext w:val="0"/>
-        <w:keepLines/>
-        <w:spacing w:before="0" w:after="80" w:line="312" w:lineRule="auto"/>
-        <w:ind w:left="227"/>
-      </w:pPr>
-      <w:r>
-        <w:rPr>
-          <w:b w:val="0"/>
-          <w:color w:val="1A1A1A"/>
-          <w:sz w:val="20"/>
-        </w:rPr>
-        <w:t>아까워하지 않던 것 하나 (선택): ____________  &gt; 예: "손주 용돈"</w:t>
       </w:r>
     </w:p>
     <w:p>
@@ -5695,6 +5769,129 @@
     </w:p>
     <w:p>
       <w:pPr>
+        <w:spacing w:before="0" w:after="40" w:line="276" w:lineRule="auto"/>
+        <w:ind w:left="227" w:right="5216"/>
+        <w:keepNext/>
+        <w:keepLines/>
+        <w:pBdr>
+          <w:bottom w:val="single" w:sz="6" w:space="4" w:color="9A9A9A"/>
+        </w:pBdr>
+      </w:pPr>
+      <w:r>
+        <w:rPr>
+          <w:sz w:val="20"/>
+        </w:rPr>
+        <w:t xml:space="preserve"> </w:t>
+      </w:r>
+    </w:p>
+    <w:p>
+      <w:pPr>
+        <w:keepNext/>
+        <w:keepLines/>
+        <w:spacing w:before="0" w:after="140" w:line="312" w:lineRule="auto"/>
+        <w:ind w:left="227"/>
+      </w:pPr>
+      <w:r>
+        <w:rPr>
+          <w:b w:val="0"/>
+          <w:color w:val="6E6E6E"/>
+          <w:sz w:val="18"/>
+        </w:rPr>
+        <w:t>□ 모름</w:t>
+      </w:r>
+    </w:p>
+    <w:p>
+      <w:pPr>
+        <w:keepNext w:val="0"/>
+        <w:keepLines/>
+        <w:spacing w:before="0" w:after="80" w:line="312" w:lineRule="auto"/>
+        <w:ind w:left="227"/>
+      </w:pPr>
+      <w:r>
+        <w:rPr>
+          <w:b w:val="0"/>
+          <w:color w:val="1A1A1A"/>
+          <w:sz w:val="20"/>
+        </w:rPr>
+        <w:t>사용 범위: □ 자유  □ 물으면만  □ 회상 참고만(발화 금지)</w:t>
+      </w:r>
+    </w:p>
+    <w:p>
+      <w:pPr>
+        <w:keepNext/>
+        <w:keepLines/>
+        <w:spacing w:before="600" w:after="160" w:line="312" w:lineRule="auto"/>
+        <w:ind w:left="0"/>
+      </w:pPr>
+      <w:r>
+        <w:rPr>
+          <w:b/>
+          <w:color w:val="1F4E79"/>
+          <w:sz w:val="24"/>
+        </w:rPr>
+        <w:t>M5. 인생 이야기 (장면 카드)</w:t>
+      </w:r>
+    </w:p>
+    <w:p>
+      <w:pPr>
+        <w:keepNext/>
+        <w:keepLines/>
+        <w:spacing w:before="0" w:after="60" w:line="312" w:lineRule="auto"/>
+        <w:ind w:left="340"/>
+      </w:pPr>
+      <w:r>
+        <w:rPr>
+          <w:b w:val="0"/>
+          <w:color w:val="6E6E6E"/>
+          <w:sz w:val="17"/>
+        </w:rPr>
+        <w:t>가이드: "~에 대해 알려주세요"가 아니라 "~했던 장면 하나를 들려주세요"처럼, 있었던 일 하나를 그림처럼 적어주세요.</w:t>
+      </w:r>
+    </w:p>
+    <w:p>
+      <w:pPr>
+        <w:spacing w:before="300" w:after="100" w:line="300" w:lineRule="auto"/>
+        <w:ind w:left="113" w:right="113"/>
+        <w:keepNext/>
+        <w:keepLines/>
+        <w:shd w:val="clear" w:fill="F1F5F9"/>
+      </w:pPr>
+      <w:r>
+        <w:rPr>
+          <w:b/>
+          <w:sz w:val="21"/>
+        </w:rPr>
+        <w:t xml:space="preserve">M5-01  </w:t>
+      </w:r>
+      <w:r>
+        <w:rPr>
+          <w:b/>
+          <w:color w:val="1A1A1A"/>
+          <w:sz w:val="21"/>
+        </w:rPr>
+        <w:t>어린 시절 살던 집을 떠올려보세요. 어떤 장면이 보이나요?</w:t>
+      </w:r>
+      <w:r>
+        <w:rPr>
+          <w:color w:val="6E6E6E"/>
+          <w:sz w:val="17"/>
+        </w:rPr>
+        <w:t xml:space="preserve">   서술 2~5문장</w:t>
+      </w:r>
+      <w:r>
+        <w:br/>
+      </w:r>
+      <w:r>
+        <w:rPr>
+          <w:b w:val="0"/>
+          <w:color w:val="6E6E6E"/>
+          <w:sz w:val="17"/>
+        </w:rPr>
+        <w:t>가이드: 방·마당·소리·냄새·누가 있었는지</w:t>
+      </w:r>
+    </w:p>
+    <w:p>
+      <w:pPr>
         <w:spacing w:before="0" w:after="120" w:line="276" w:lineRule="auto"/>
         <w:ind w:left="227"/>
         <w:keepNext/>
@@ -5712,7 +5909,24 @@
     </w:p>
     <w:p>
       <w:pPr>
-        <w:keepNext w:val="0"/>
+        <w:spacing w:before="0" w:after="120" w:line="276" w:lineRule="auto"/>
+        <w:ind w:left="227"/>
+        <w:keepNext/>
+        <w:keepLines/>
+        <w:pBdr>
+          <w:bottom w:val="single" w:sz="6" w:space="4" w:color="9A9A9A"/>
+        </w:pBdr>
+      </w:pPr>
+      <w:r>
+        <w:rPr>
+          <w:sz w:val="20"/>
+        </w:rPr>
+        <w:t xml:space="preserve"> </w:t>
+      </w:r>
+    </w:p>
+    <w:p>
+      <w:pPr>
+        <w:keepNext/>
         <w:keepLines/>
         <w:spacing w:before="0" w:after="80" w:line="312" w:lineRule="auto"/>
         <w:ind w:left="227"/>
@@ -5723,39 +5937,23 @@
           <w:color w:val="1A1A1A"/>
           <w:sz w:val="20"/>
         </w:rPr>
+        <w:t>시기: ______   감정: ______</w:t>
+      </w:r>
+    </w:p>
+    <w:p>
+      <w:pPr>
+        <w:keepNext w:val="0"/>
+        <w:keepLines/>
+        <w:spacing w:before="0" w:after="80" w:line="312" w:lineRule="auto"/>
+        <w:ind w:left="227"/>
+      </w:pPr>
+      <w:r>
+        <w:rPr>
+          <w:b w:val="0"/>
+          <w:color w:val="1A1A1A"/>
+          <w:sz w:val="20"/>
+        </w:rPr>
         <w:t>사용 범위: □ 자유  □ 물으면만  □ 회상 참고만(발화 금지)</w:t>
-      </w:r>
-    </w:p>
-    <w:p>
-      <w:pPr>
-        <w:keepNext/>
-        <w:keepLines/>
-        <w:spacing w:before="600" w:after="160" w:line="312" w:lineRule="auto"/>
-        <w:ind w:left="0"/>
-      </w:pPr>
-      <w:r>
-        <w:rPr>
-          <w:b/>
-          <w:color w:val="1F4E79"/>
-          <w:sz w:val="24"/>
-        </w:rPr>
-        <w:t>M5. 인생 이야기 (장면 카드)</w:t>
-      </w:r>
-    </w:p>
-    <w:p>
-      <w:pPr>
-        <w:keepNext w:val="0"/>
-        <w:keepLines/>
-        <w:spacing w:before="0" w:after="80" w:line="312" w:lineRule="auto"/>
-        <w:ind w:left="0"/>
-      </w:pPr>
-      <w:r>
-        <w:rPr>
-          <w:b w:val="0"/>
-          <w:color w:val="6E6E6E"/>
-          <w:sz w:val="18"/>
-        </w:rPr>
-        <w:t>"~에 대해 알려주세요"가 아니라 "~했던 장면 하나를 들려주세요". 각 답은 M7 카드 한 장으로 저장됩니다.</w:t>
       </w:r>
     </w:p>
     <w:p>
@@ -5771,7 +5969,7 @@
           <w:b/>
           <w:sz w:val="21"/>
         </w:rPr>
-        <w:t xml:space="preserve">M5-01  </w:t>
+        <w:t xml:space="preserve">M5-02  </w:t>
       </w:r>
       <w:r>
         <w:rPr>
@@ -5779,7 +5977,7 @@
           <w:color w:val="1A1A1A"/>
           <w:sz w:val="21"/>
         </w:rPr>
-        <w:t>어린 시절 살던 집을 떠올려보세요. 어떤 장면이 보이나요?</w:t>
+        <w:t>학창 시절이나 청년 시절 이야기 하나</w:t>
       </w:r>
       <w:r>
         <w:rPr>
@@ -5797,7 +5995,7 @@
           <w:color w:val="6E6E6E"/>
           <w:sz w:val="17"/>
         </w:rPr>
-        <w:t>가이드: 방·마당·소리·냄새·누가 있었는지</w:t>
+        <w:t>가이드: 한 사건을 골라 처음부터 끝까지</w:t>
       </w:r>
     </w:p>
     <w:p>
@@ -5847,7 +6045,7 @@
           <w:color w:val="1A1A1A"/>
           <w:sz w:val="20"/>
         </w:rPr>
-        <w:t>시기: ______   감정: ______   확실성: □ 확실  □ 대략  □ 추정</w:t>
+        <w:t>시기: ______   감정: ______</w:t>
       </w:r>
     </w:p>
     <w:p>
@@ -5879,7 +6077,7 @@
           <w:b/>
           <w:sz w:val="21"/>
         </w:rPr>
-        <w:t xml:space="preserve">M5-02  </w:t>
+        <w:t xml:space="preserve">M5-03  </w:t>
       </w:r>
       <w:r>
         <w:rPr>
@@ -5887,14 +6085,14 @@
           <w:color w:val="1A1A1A"/>
           <w:sz w:val="21"/>
         </w:rPr>
-        <w:t>학창 시절이나 청년 시절 이야기 하나</w:t>
+        <w:t>(배우자가 있다면) 배우자와 처음 만났을 때 이야기</w:t>
       </w:r>
       <w:r>
         <w:rPr>
           <w:color w:val="6E6E6E"/>
           <w:sz w:val="17"/>
         </w:rPr>
-        <w:t xml:space="preserve">   서술 2~5문장</w:t>
+        <w:t xml:space="preserve">   서술</w:t>
       </w:r>
       <w:r>
         <w:br/>
@@ -5905,7 +6103,7 @@
           <w:color w:val="6E6E6E"/>
           <w:sz w:val="17"/>
         </w:rPr>
-        <w:t>가이드: 한 사건을 골라 처음부터 끝까지</w:t>
+        <w:t>가이드: 어디서·어떻게·첫인상. 해당 없으면 건너뛰기</w:t>
       </w:r>
     </w:p>
     <w:p>
@@ -5955,7 +6153,7 @@
           <w:color w:val="1A1A1A"/>
           <w:sz w:val="20"/>
         </w:rPr>
-        <w:t>시기: ______   감정: ______   확실성: □ 확실  □ 대략  □ 추정</w:t>
+        <w:t>시기: ______   감정: ______</w:t>
       </w:r>
     </w:p>
     <w:p>
@@ -5987,7 +6185,7 @@
           <w:b/>
           <w:sz w:val="21"/>
         </w:rPr>
-        <w:t xml:space="preserve">M5-03  </w:t>
+        <w:t xml:space="preserve">M5-04  </w:t>
       </w:r>
       <w:r>
         <w:rPr>
@@ -5995,7 +6193,7 @@
           <w:color w:val="1A1A1A"/>
           <w:sz w:val="21"/>
         </w:rPr>
-        <w:t>(배우자가 있다면) 배우자와 처음 만났을 때 이야기</w:t>
+        <w:t>(자녀가 있다면) 자녀가 어릴 때 기억나는 장면 하나</w:t>
       </w:r>
       <w:r>
         <w:rPr>
@@ -6003,6 +6201,103 @@
           <w:sz w:val="17"/>
         </w:rPr>
         <w:t xml:space="preserve">   서술</w:t>
+      </w:r>
+    </w:p>
+    <w:p>
+      <w:pPr>
+        <w:spacing w:before="0" w:after="120" w:line="276" w:lineRule="auto"/>
+        <w:ind w:left="227"/>
+        <w:keepNext/>
+        <w:keepLines/>
+        <w:pBdr>
+          <w:bottom w:val="single" w:sz="6" w:space="4" w:color="9A9A9A"/>
+        </w:pBdr>
+      </w:pPr>
+      <w:r>
+        <w:rPr>
+          <w:sz w:val="20"/>
+        </w:rPr>
+        <w:t xml:space="preserve"> </w:t>
+      </w:r>
+    </w:p>
+    <w:p>
+      <w:pPr>
+        <w:spacing w:before="0" w:after="120" w:line="276" w:lineRule="auto"/>
+        <w:ind w:left="227"/>
+        <w:keepNext/>
+        <w:keepLines/>
+        <w:pBdr>
+          <w:bottom w:val="single" w:sz="6" w:space="4" w:color="9A9A9A"/>
+        </w:pBdr>
+      </w:pPr>
+      <w:r>
+        <w:rPr>
+          <w:sz w:val="20"/>
+        </w:rPr>
+        <w:t xml:space="preserve"> </w:t>
+      </w:r>
+    </w:p>
+    <w:p>
+      <w:pPr>
+        <w:keepNext/>
+        <w:keepLines/>
+        <w:spacing w:before="0" w:after="80" w:line="312" w:lineRule="auto"/>
+        <w:ind w:left="227"/>
+      </w:pPr>
+      <w:r>
+        <w:rPr>
+          <w:b w:val="0"/>
+          <w:color w:val="1A1A1A"/>
+          <w:sz w:val="20"/>
+        </w:rPr>
+        <w:t>시기: ______   감정: ______</w:t>
+      </w:r>
+    </w:p>
+    <w:p>
+      <w:pPr>
+        <w:keepNext w:val="0"/>
+        <w:keepLines/>
+        <w:spacing w:before="0" w:after="80" w:line="312" w:lineRule="auto"/>
+        <w:ind w:left="227"/>
+      </w:pPr>
+      <w:r>
+        <w:rPr>
+          <w:b w:val="0"/>
+          <w:color w:val="1A1A1A"/>
+          <w:sz w:val="20"/>
+        </w:rPr>
+        <w:t>사용 범위: □ 자유  □ 물으면만  □ 회상 참고만(발화 금지)</w:t>
+      </w:r>
+    </w:p>
+    <w:p>
+      <w:pPr>
+        <w:spacing w:before="300" w:after="100" w:line="300" w:lineRule="auto"/>
+        <w:ind w:left="113" w:right="113"/>
+        <w:keepNext/>
+        <w:keepLines/>
+        <w:shd w:val="clear" w:fill="F1F5F9"/>
+      </w:pPr>
+      <w:r>
+        <w:rPr>
+          <w:b/>
+          <w:sz w:val="21"/>
+        </w:rPr>
+        <w:t xml:space="preserve">M5-05  </w:t>
+      </w:r>
+      <w:r>
+        <w:rPr>
+          <w:b/>
+          <w:color w:val="1A1A1A"/>
+          <w:sz w:val="21"/>
+        </w:rPr>
+        <w:t>일이나 살림에서 가장 애썼던 시절</w:t>
+      </w:r>
+      <w:r>
+        <w:rPr>
+          <w:color w:val="6E6E6E"/>
+          <w:sz w:val="17"/>
+        </w:rPr>
+        <w:t xml:space="preserve">   서술 2~5문장</w:t>
       </w:r>
       <w:r>
         <w:br/>
@@ -6013,7 +6308,7 @@
           <w:color w:val="6E6E6E"/>
           <w:sz w:val="17"/>
         </w:rPr>
-        <w:t>가이드: 어디서·어떻게·첫인상. 해당 없으면 건너뛰기</w:t>
+        <w:t>가이드: 언제·무엇 때문에·어떻게 버텼는지</w:t>
       </w:r>
     </w:p>
     <w:p>
@@ -6063,7 +6358,7 @@
           <w:color w:val="1A1A1A"/>
           <w:sz w:val="20"/>
         </w:rPr>
-        <w:t>시기: ______   감정: ______   확실성: □ 확실  □ 대략  □ 추정</w:t>
+        <w:t>시기: ______   감정: ______</w:t>
       </w:r>
     </w:p>
     <w:p>
@@ -6095,7 +6390,7 @@
           <w:b/>
           <w:sz w:val="21"/>
         </w:rPr>
-        <w:t xml:space="preserve">M5-04  </w:t>
+        <w:t xml:space="preserve">M5-06  </w:t>
       </w:r>
       <w:r>
         <w:rPr>
@@ -6103,7 +6398,7 @@
           <w:color w:val="1A1A1A"/>
           <w:sz w:val="21"/>
         </w:rPr>
-        <w:t>(자녀가 있다면) 자녀가 어릴 때 기억나는 장면 하나</w:t>
+        <w:t>가장 행복해 보였던 때는 언제였나요? 그때의 장면 하나</w:t>
       </w:r>
       <w:r>
         <w:rPr>
@@ -6111,6 +6406,17 @@
           <w:sz w:val="17"/>
         </w:rPr>
         <w:t xml:space="preserve">   서술</w:t>
+      </w:r>
+      <w:r>
+        <w:br/>
+      </w:r>
+      <w:r>
+        <w:rPr>
+          <w:b w:val="0"/>
+          <w:color w:val="B03A2B"/>
+          <w:sz w:val="17"/>
+        </w:rPr>
+        <w:t>예: "손주들이 태어났을 때" (한 장면으로)</w:t>
       </w:r>
     </w:p>
     <w:p>
@@ -6160,7 +6466,7 @@
           <w:color w:val="1A1A1A"/>
           <w:sz w:val="20"/>
         </w:rPr>
-        <w:t>시기: ______   감정: ______   확실성: □ 확실  □ 대략  □ 추정</w:t>
+        <w:t>시기: ______   감정: ______</w:t>
       </w:r>
     </w:p>
     <w:p>
@@ -6192,7 +6498,7 @@
           <w:b/>
           <w:sz w:val="21"/>
         </w:rPr>
-        <w:t xml:space="preserve">M5-05  </w:t>
+        <w:t xml:space="preserve">M5-07  </w:t>
       </w:r>
       <w:r>
         <w:rPr>
@@ -6200,14 +6506,190 @@
           <w:color w:val="1A1A1A"/>
           <w:sz w:val="21"/>
         </w:rPr>
-        <w:t>일이나 살림에서 가장 애썼던 시절</w:t>
+        <w:t>힘들었던 시기가 있었나요? 말하고 싶은 만큼만요.</w:t>
       </w:r>
       <w:r>
         <w:rPr>
           <w:color w:val="6E6E6E"/>
           <w:sz w:val="17"/>
         </w:rPr>
-        <w:t xml:space="preserve">   서술 2~5문장</w:t>
+        <w:t xml:space="preserve">   하나 선택</w:t>
+      </w:r>
+    </w:p>
+    <w:p>
+      <w:pPr>
+        <w:keepNext/>
+        <w:keepLines/>
+        <w:spacing w:before="0" w:after="80" w:line="312" w:lineRule="auto"/>
+        <w:ind w:left="283"/>
+      </w:pPr>
+      <w:r>
+        <w:rPr>
+          <w:b w:val="0"/>
+          <w:color w:val="1A1A1A"/>
+          <w:sz w:val="20"/>
+        </w:rPr>
+        <w:t>□ 말하겠다</w:t>
+      </w:r>
+    </w:p>
+    <w:p>
+      <w:pPr>
+        <w:keepNext/>
+        <w:keepLines/>
+        <w:spacing w:before="0" w:after="80" w:line="312" w:lineRule="auto"/>
+        <w:ind w:left="283"/>
+      </w:pPr>
+      <w:r>
+        <w:rPr>
+          <w:b w:val="0"/>
+          <w:color w:val="1A1A1A"/>
+          <w:sz w:val="20"/>
+        </w:rPr>
+        <w:t>□ 모른다</w:t>
+      </w:r>
+    </w:p>
+    <w:p>
+      <w:pPr>
+        <w:keepNext w:val="0"/>
+        <w:keepLines/>
+        <w:spacing w:before="0" w:after="80" w:line="312" w:lineRule="auto"/>
+        <w:ind w:left="283"/>
+      </w:pPr>
+      <w:r>
+        <w:rPr>
+          <w:b w:val="0"/>
+          <w:color w:val="1A1A1A"/>
+          <w:sz w:val="20"/>
+        </w:rPr>
+        <w:t>□ 말하고 싶지 않다</w:t>
+      </w:r>
+    </w:p>
+    <w:p>
+      <w:pPr>
+        <w:spacing w:before="300" w:after="100" w:line="300" w:lineRule="auto"/>
+        <w:ind w:left="113" w:right="113"/>
+        <w:keepNext/>
+        <w:keepLines/>
+        <w:shd w:val="clear" w:fill="F1F5F9"/>
+      </w:pPr>
+      <w:r>
+        <w:rPr>
+          <w:b/>
+          <w:sz w:val="21"/>
+        </w:rPr>
+        <w:t xml:space="preserve">M5-07A  </w:t>
+      </w:r>
+      <w:r>
+        <w:rPr>
+          <w:b/>
+          <w:color w:val="1A1A1A"/>
+          <w:sz w:val="21"/>
+        </w:rPr>
+        <w:t>(M5-07에서 "말하겠다"를 고르셨다면) 어떤 시기였나요?</w:t>
+      </w:r>
+      <w:r>
+        <w:rPr>
+          <w:color w:val="6E6E6E"/>
+          <w:sz w:val="17"/>
+        </w:rPr>
+        <w:t xml:space="preserve">   서술</w:t>
+      </w:r>
+    </w:p>
+    <w:p>
+      <w:pPr>
+        <w:spacing w:before="0" w:after="120" w:line="276" w:lineRule="auto"/>
+        <w:ind w:left="227"/>
+        <w:keepNext/>
+        <w:keepLines/>
+        <w:pBdr>
+          <w:bottom w:val="single" w:sz="6" w:space="4" w:color="9A9A9A"/>
+        </w:pBdr>
+      </w:pPr>
+      <w:r>
+        <w:rPr>
+          <w:sz w:val="20"/>
+        </w:rPr>
+        <w:t xml:space="preserve"> </w:t>
+      </w:r>
+    </w:p>
+    <w:p>
+      <w:pPr>
+        <w:spacing w:before="0" w:after="120" w:line="276" w:lineRule="auto"/>
+        <w:ind w:left="227"/>
+        <w:keepNext/>
+        <w:keepLines/>
+        <w:pBdr>
+          <w:bottom w:val="single" w:sz="6" w:space="4" w:color="9A9A9A"/>
+        </w:pBdr>
+      </w:pPr>
+      <w:r>
+        <w:rPr>
+          <w:sz w:val="20"/>
+        </w:rPr>
+        <w:t xml:space="preserve"> </w:t>
+      </w:r>
+    </w:p>
+    <w:p>
+      <w:pPr>
+        <w:keepNext/>
+        <w:keepLines/>
+        <w:spacing w:before="0" w:after="80" w:line="312" w:lineRule="auto"/>
+        <w:ind w:left="227"/>
+      </w:pPr>
+      <w:r>
+        <w:rPr>
+          <w:b w:val="0"/>
+          <w:color w:val="1A1A1A"/>
+          <w:sz w:val="20"/>
+        </w:rPr>
+        <w:t>시기: ______   감정: ______</w:t>
+      </w:r>
+    </w:p>
+    <w:p>
+      <w:pPr>
+        <w:keepNext w:val="0"/>
+        <w:keepLines/>
+        <w:spacing w:before="0" w:after="80" w:line="312" w:lineRule="auto"/>
+        <w:ind w:left="227"/>
+      </w:pPr>
+      <w:r>
+        <w:rPr>
+          <w:b w:val="0"/>
+          <w:color w:val="1A1A1A"/>
+          <w:sz w:val="20"/>
+        </w:rPr>
+        <w:t>사용 범위: □ 자유  □ 물으면만  □ 회상 참고만(발화 금지)</w:t>
+      </w:r>
+    </w:p>
+    <w:p>
+      <w:pPr>
+        <w:spacing w:before="300" w:after="100" w:line="300" w:lineRule="auto"/>
+        <w:ind w:left="113" w:right="113"/>
+        <w:keepNext/>
+        <w:keepLines/>
+        <w:shd w:val="clear" w:fill="F1F5F9"/>
+      </w:pPr>
+      <w:r>
+        <w:rPr>
+          <w:b/>
+          <w:sz w:val="21"/>
+        </w:rPr>
+        <w:t xml:space="preserve">M5-08  </w:t>
+      </w:r>
+      <w:r>
+        <w:rPr>
+          <w:b/>
+          <w:color w:val="1A1A1A"/>
+          <w:sz w:val="21"/>
+        </w:rPr>
+        <w:t>말년의 하루는 어떻게 흘러갔나요?</w:t>
+      </w:r>
+      <w:r>
+        <w:rPr>
+          <w:color w:val="6E6E6E"/>
+          <w:sz w:val="17"/>
+        </w:rPr>
+        <w:t xml:space="preserve">   서술 3~5문장</w:t>
       </w:r>
       <w:r>
         <w:br/>
@@ -6218,7 +6700,7 @@
           <w:color w:val="6E6E6E"/>
           <w:sz w:val="17"/>
         </w:rPr>
-        <w:t>가이드: 언제·무엇 때문에·어떻게 버텼는지</w:t>
+        <w:t>가이드: 아침 → 낮 → 저녁 순으로 자주 하던 일과 있던 장소</w:t>
       </w:r>
     </w:p>
     <w:p>
@@ -6268,7 +6750,7 @@
           <w:color w:val="1A1A1A"/>
           <w:sz w:val="20"/>
         </w:rPr>
-        <w:t>시기: ______   감정: ______   확실성: □ 확실  □ 대략  □ 추정</w:t>
+        <w:t>시기: ______   감정: ______</w:t>
       </w:r>
     </w:p>
     <w:p>
@@ -6300,7 +6782,7 @@
           <w:b/>
           <w:sz w:val="21"/>
         </w:rPr>
-        <w:t xml:space="preserve">M5-06  </w:t>
+        <w:t xml:space="preserve">M5-09  </w:t>
       </w:r>
       <w:r>
         <w:rPr>
@@ -6308,7 +6790,7 @@
           <w:color w:val="1A1A1A"/>
           <w:sz w:val="21"/>
         </w:rPr>
-        <w:t>가장 행복해 보였던 때는 언제였나요? 그때의 장면 하나</w:t>
+        <w:t>더 남기고 싶은 시절이나 장면이 있나요?</w:t>
       </w:r>
       <w:r>
         <w:rPr>
@@ -6316,17 +6798,6 @@
           <w:sz w:val="17"/>
         </w:rPr>
         <w:t xml:space="preserve">   서술</w:t>
-      </w:r>
-      <w:r>
-        <w:br/>
-      </w:r>
-      <w:r>
-        <w:rPr>
-          <w:b w:val="0"/>
-          <w:color w:val="B03A2B"/>
-          <w:sz w:val="17"/>
-        </w:rPr>
-        <w:t>예: "손주들이 태어났을 때" (한 장면으로)</w:t>
       </w:r>
     </w:p>
     <w:p>
@@ -6376,7 +6847,7 @@
           <w:color w:val="1A1A1A"/>
           <w:sz w:val="20"/>
         </w:rPr>
-        <w:t>시기: ______   감정: ______   확실성: □ 확실  □ 대략  □ 추정</w:t>
+        <w:t>시기: ______   감정: ______</w:t>
       </w:r>
     </w:p>
     <w:p>
@@ -6397,372 +6868,7 @@
     </w:p>
     <w:p>
       <w:pPr>
-        <w:spacing w:before="300" w:after="100" w:line="300" w:lineRule="auto"/>
-        <w:ind w:left="113" w:right="113"/>
         <w:keepNext/>
-        <w:keepLines/>
-        <w:shd w:val="clear" w:fill="F1F5F9"/>
-      </w:pPr>
-      <w:r>
-        <w:rPr>
-          <w:b/>
-          <w:sz w:val="21"/>
-        </w:rPr>
-        <w:t xml:space="preserve">M5-07  </w:t>
-      </w:r>
-      <w:r>
-        <w:rPr>
-          <w:b/>
-          <w:color w:val="1A1A1A"/>
-          <w:sz w:val="21"/>
-        </w:rPr>
-        <w:t>힘들었던 시기가 있었나요? 말하고 싶은 만큼만요.</w:t>
-      </w:r>
-      <w:r>
-        <w:rPr>
-          <w:color w:val="6E6E6E"/>
-          <w:sz w:val="17"/>
-        </w:rPr>
-        <w:t xml:space="preserve">   하나 선택</w:t>
-      </w:r>
-    </w:p>
-    <w:p>
-      <w:pPr>
-        <w:keepNext/>
-        <w:keepLines/>
-        <w:spacing w:before="0" w:after="80" w:line="312" w:lineRule="auto"/>
-        <w:ind w:left="283"/>
-      </w:pPr>
-      <w:r>
-        <w:rPr>
-          <w:b w:val="0"/>
-          <w:color w:val="1A1A1A"/>
-          <w:sz w:val="20"/>
-        </w:rPr>
-        <w:t>□ 말하겠다</w:t>
-      </w:r>
-    </w:p>
-    <w:p>
-      <w:pPr>
-        <w:keepNext/>
-        <w:keepLines/>
-        <w:spacing w:before="0" w:after="80" w:line="312" w:lineRule="auto"/>
-        <w:ind w:left="283"/>
-      </w:pPr>
-      <w:r>
-        <w:rPr>
-          <w:b w:val="0"/>
-          <w:color w:val="1A1A1A"/>
-          <w:sz w:val="20"/>
-        </w:rPr>
-        <w:t>□ 모른다</w:t>
-      </w:r>
-    </w:p>
-    <w:p>
-      <w:pPr>
-        <w:keepNext w:val="0"/>
-        <w:keepLines/>
-        <w:spacing w:before="0" w:after="80" w:line="312" w:lineRule="auto"/>
-        <w:ind w:left="283"/>
-      </w:pPr>
-      <w:r>
-        <w:rPr>
-          <w:b w:val="0"/>
-          <w:color w:val="1A1A1A"/>
-          <w:sz w:val="20"/>
-        </w:rPr>
-        <w:t>□ 말하고 싶지 않다</w:t>
-      </w:r>
-    </w:p>
-    <w:p>
-      <w:pPr>
-        <w:spacing w:before="300" w:after="100" w:line="300" w:lineRule="auto"/>
-        <w:ind w:left="113" w:right="113"/>
-        <w:keepNext/>
-        <w:keepLines/>
-        <w:shd w:val="clear" w:fill="F1F5F9"/>
-      </w:pPr>
-      <w:r>
-        <w:rPr>
-          <w:b/>
-          <w:sz w:val="21"/>
-        </w:rPr>
-        <w:t xml:space="preserve">M5-07A  </w:t>
-      </w:r>
-      <w:r>
-        <w:rPr>
-          <w:b/>
-          <w:color w:val="1A1A1A"/>
-          <w:sz w:val="21"/>
-        </w:rPr>
-        <w:t>(M5-07에서 "말하겠다"를 고르셨다면) 어떤 시기였나요?</w:t>
-      </w:r>
-      <w:r>
-        <w:rPr>
-          <w:color w:val="6E6E6E"/>
-          <w:sz w:val="17"/>
-        </w:rPr>
-        <w:t xml:space="preserve">   서술</w:t>
-      </w:r>
-    </w:p>
-    <w:p>
-      <w:pPr>
-        <w:spacing w:before="0" w:after="120" w:line="276" w:lineRule="auto"/>
-        <w:ind w:left="227"/>
-        <w:keepNext/>
-        <w:keepLines/>
-        <w:pBdr>
-          <w:bottom w:val="single" w:sz="6" w:space="4" w:color="9A9A9A"/>
-        </w:pBdr>
-      </w:pPr>
-      <w:r>
-        <w:rPr>
-          <w:sz w:val="20"/>
-        </w:rPr>
-        <w:t xml:space="preserve"> </w:t>
-      </w:r>
-    </w:p>
-    <w:p>
-      <w:pPr>
-        <w:spacing w:before="0" w:after="120" w:line="276" w:lineRule="auto"/>
-        <w:ind w:left="227"/>
-        <w:keepNext/>
-        <w:keepLines/>
-        <w:pBdr>
-          <w:bottom w:val="single" w:sz="6" w:space="4" w:color="9A9A9A"/>
-        </w:pBdr>
-      </w:pPr>
-      <w:r>
-        <w:rPr>
-          <w:sz w:val="20"/>
-        </w:rPr>
-        <w:t xml:space="preserve"> </w:t>
-      </w:r>
-    </w:p>
-    <w:p>
-      <w:pPr>
-        <w:keepNext w:val="0"/>
-        <w:keepLines/>
-        <w:spacing w:before="0" w:after="80" w:line="312" w:lineRule="auto"/>
-        <w:ind w:left="227"/>
-      </w:pPr>
-      <w:r>
-        <w:rPr>
-          <w:b w:val="0"/>
-          <w:color w:val="1A1A1A"/>
-          <w:sz w:val="20"/>
-        </w:rPr>
-        <w:t>사용 범위: □ 자유  □ 물으면만  □ 회상 참고만(발화 금지)</w:t>
-      </w:r>
-    </w:p>
-    <w:p>
-      <w:pPr>
-        <w:spacing w:before="300" w:after="100" w:line="300" w:lineRule="auto"/>
-        <w:ind w:left="113" w:right="113"/>
-        <w:keepNext/>
-        <w:keepLines/>
-        <w:shd w:val="clear" w:fill="F1F5F9"/>
-      </w:pPr>
-      <w:r>
-        <w:rPr>
-          <w:b/>
-          <w:sz w:val="21"/>
-        </w:rPr>
-        <w:t xml:space="preserve">M5-08  </w:t>
-      </w:r>
-      <w:r>
-        <w:rPr>
-          <w:b/>
-          <w:color w:val="1A1A1A"/>
-          <w:sz w:val="21"/>
-        </w:rPr>
-        <w:t>말년의 하루는 어떻게 흘러갔나요?</w:t>
-      </w:r>
-      <w:r>
-        <w:rPr>
-          <w:color w:val="6E6E6E"/>
-          <w:sz w:val="17"/>
-        </w:rPr>
-        <w:t xml:space="preserve">   서술 3~5문장</w:t>
-      </w:r>
-      <w:r>
-        <w:br/>
-      </w:r>
-      <w:r>
-        <w:rPr>
-          <w:b w:val="0"/>
-          <w:color w:val="6E6E6E"/>
-          <w:sz w:val="17"/>
-        </w:rPr>
-        <w:t>가이드: 아침 → 낮 → 저녁 순으로 자주 하던 일과 있던 장소</w:t>
-      </w:r>
-    </w:p>
-    <w:p>
-      <w:pPr>
-        <w:spacing w:before="0" w:after="120" w:line="276" w:lineRule="auto"/>
-        <w:ind w:left="227"/>
-        <w:keepNext/>
-        <w:keepLines/>
-        <w:pBdr>
-          <w:bottom w:val="single" w:sz="6" w:space="4" w:color="9A9A9A"/>
-        </w:pBdr>
-      </w:pPr>
-      <w:r>
-        <w:rPr>
-          <w:sz w:val="20"/>
-        </w:rPr>
-        <w:t xml:space="preserve"> </w:t>
-      </w:r>
-    </w:p>
-    <w:p>
-      <w:pPr>
-        <w:spacing w:before="0" w:after="120" w:line="276" w:lineRule="auto"/>
-        <w:ind w:left="227"/>
-        <w:keepNext/>
-        <w:keepLines/>
-        <w:pBdr>
-          <w:bottom w:val="single" w:sz="6" w:space="4" w:color="9A9A9A"/>
-        </w:pBdr>
-      </w:pPr>
-      <w:r>
-        <w:rPr>
-          <w:sz w:val="20"/>
-        </w:rPr>
-        <w:t xml:space="preserve"> </w:t>
-      </w:r>
-    </w:p>
-    <w:p>
-      <w:pPr>
-        <w:keepNext/>
-        <w:keepLines/>
-        <w:spacing w:before="0" w:after="80" w:line="312" w:lineRule="auto"/>
-        <w:ind w:left="227"/>
-      </w:pPr>
-      <w:r>
-        <w:rPr>
-          <w:b w:val="0"/>
-          <w:color w:val="1A1A1A"/>
-          <w:sz w:val="20"/>
-        </w:rPr>
-        <w:t>시기: ______   감정: ______   확실성: □ 확실  □ 대략  □ 추정</w:t>
-      </w:r>
-    </w:p>
-    <w:p>
-      <w:pPr>
-        <w:keepNext w:val="0"/>
-        <w:keepLines/>
-        <w:spacing w:before="0" w:after="80" w:line="312" w:lineRule="auto"/>
-        <w:ind w:left="227"/>
-      </w:pPr>
-      <w:r>
-        <w:rPr>
-          <w:b w:val="0"/>
-          <w:color w:val="1A1A1A"/>
-          <w:sz w:val="20"/>
-        </w:rPr>
-        <w:t>사용 범위: □ 자유  □ 물으면만  □ 회상 참고만(발화 금지)</w:t>
-      </w:r>
-    </w:p>
-    <w:p>
-      <w:pPr>
-        <w:spacing w:before="300" w:after="100" w:line="300" w:lineRule="auto"/>
-        <w:ind w:left="113" w:right="113"/>
-        <w:keepNext/>
-        <w:keepLines/>
-        <w:shd w:val="clear" w:fill="F1F5F9"/>
-      </w:pPr>
-      <w:r>
-        <w:rPr>
-          <w:b/>
-          <w:sz w:val="21"/>
-        </w:rPr>
-        <w:t xml:space="preserve">M5-09  </w:t>
-      </w:r>
-      <w:r>
-        <w:rPr>
-          <w:b/>
-          <w:color w:val="1A1A1A"/>
-          <w:sz w:val="21"/>
-        </w:rPr>
-        <w:t>더 남기고 싶은 시절이나 장면이 있나요?</w:t>
-      </w:r>
-      <w:r>
-        <w:rPr>
-          <w:color w:val="6E6E6E"/>
-          <w:sz w:val="17"/>
-        </w:rPr>
-        <w:t xml:space="preserve">   서술</w:t>
-      </w:r>
-    </w:p>
-    <w:p>
-      <w:pPr>
-        <w:spacing w:before="0" w:after="120" w:line="276" w:lineRule="auto"/>
-        <w:ind w:left="227"/>
-        <w:keepNext/>
-        <w:keepLines/>
-        <w:pBdr>
-          <w:bottom w:val="single" w:sz="6" w:space="4" w:color="9A9A9A"/>
-        </w:pBdr>
-      </w:pPr>
-      <w:r>
-        <w:rPr>
-          <w:sz w:val="20"/>
-        </w:rPr>
-        <w:t xml:space="preserve"> </w:t>
-      </w:r>
-    </w:p>
-    <w:p>
-      <w:pPr>
-        <w:spacing w:before="0" w:after="120" w:line="276" w:lineRule="auto"/>
-        <w:ind w:left="227"/>
-        <w:keepNext/>
-        <w:keepLines/>
-        <w:pBdr>
-          <w:bottom w:val="single" w:sz="6" w:space="4" w:color="9A9A9A"/>
-        </w:pBdr>
-      </w:pPr>
-      <w:r>
-        <w:rPr>
-          <w:sz w:val="20"/>
-        </w:rPr>
-        <w:t xml:space="preserve"> </w:t>
-      </w:r>
-    </w:p>
-    <w:p>
-      <w:pPr>
-        <w:keepNext/>
-        <w:keepLines/>
-        <w:spacing w:before="0" w:after="80" w:line="312" w:lineRule="auto"/>
-        <w:ind w:left="227"/>
-      </w:pPr>
-      <w:r>
-        <w:rPr>
-          <w:b w:val="0"/>
-          <w:color w:val="1A1A1A"/>
-          <w:sz w:val="20"/>
-        </w:rPr>
-        <w:t>시기: ______   감정: ______   확실성: □ 확실  □ 대략  □ 추정</w:t>
-      </w:r>
-    </w:p>
-    <w:p>
-      <w:pPr>
-        <w:keepNext w:val="0"/>
-        <w:keepLines/>
-        <w:spacing w:before="0" w:after="80" w:line="312" w:lineRule="auto"/>
-        <w:ind w:left="227"/>
-      </w:pPr>
-      <w:r>
-        <w:rPr>
-          <w:b w:val="0"/>
-          <w:color w:val="1A1A1A"/>
-          <w:sz w:val="20"/>
-        </w:rPr>
-        <w:t>사용 범위: □ 자유  □ 물으면만  □ 회상 참고만(발화 금지)</w:t>
-      </w:r>
-    </w:p>
-    <w:p>
-      <w:pPr>
-        <w:keepNext w:val="0"/>
         <w:keepLines/>
         <w:spacing w:before="600" w:after="160" w:line="312" w:lineRule="auto"/>
         <w:ind w:left="0"/>
@@ -6995,7 +7101,7 @@
       <w:pPr>
         <w:spacing w:before="0" w:after="120" w:line="276" w:lineRule="auto"/>
         <w:ind w:left="227"/>
-        <w:keepNext w:val="0"/>
+        <w:keepNext/>
         <w:keepLines/>
         <w:pBdr>
           <w:bottom w:val="single" w:sz="6" w:space="4" w:color="9A9A9A"/>
@@ -7081,10 +7187,17 @@
       <w:r>
         <w:rPr>
           <w:b w:val="0"/>
-          <w:color w:val="1A1A1A"/>
+          <w:color w:val="1F4E79"/>
           <w:sz w:val="20"/>
         </w:rPr>
-        <w:t>장면 (선택):</w:t>
+        <w:t xml:space="preserve">그렇게 챙기시던 장면이 있으면 적어주세요.  </w:t>
+      </w:r>
+      <w:r>
+        <w:rPr>
+          <w:color w:val="6E6E6E"/>
+          <w:sz w:val="17"/>
+        </w:rPr>
+        <w:t>서술 1~3문장 · 선택</w:t>
       </w:r>
     </w:p>
     <w:p>
@@ -7621,23 +7734,49 @@
           <w:color w:val="1F4E79"/>
           <w:sz w:val="24"/>
         </w:rPr>
-        <w:t>M7. 대표 기억 카드 (8장 이상 권장)</w:t>
-      </w:r>
-    </w:p>
-    <w:p>
-      <w:pPr>
+        <w:t>M7. 대표 기억 카드</w:t>
+      </w:r>
+    </w:p>
+    <w:p>
+      <w:pPr>
+        <w:spacing w:before="300" w:after="100" w:line="300" w:lineRule="auto"/>
+        <w:ind w:left="113" w:right="113"/>
         <w:keepNext/>
         <w:keepLines/>
-        <w:spacing w:before="240" w:after="100" w:line="312" w:lineRule="auto"/>
-        <w:ind w:left="0"/>
-      </w:pPr>
+        <w:shd w:val="clear" w:fill="F1F5F9"/>
+      </w:pPr>
+      <w:r>
+        <w:rPr>
+          <w:b/>
+          <w:sz w:val="21"/>
+        </w:rPr>
+        <w:t xml:space="preserve">M7-01  </w:t>
+      </w:r>
       <w:r>
         <w:rPr>
           <w:b/>
           <w:color w:val="1A1A1A"/>
           <w:sz w:val="21"/>
         </w:rPr>
-        <w:t>"기억 하나를 장면처럼 들려주세요. 언제, 어디서, 누구와, 무슨 일이 있었나요? 그때 기분은요?"</w:t>
+        <w:t>기억 하나를 장면처럼 들려주세요. 언제, 어디서, 누구와, 무슨 일이 있었나요? 그때 기분은요?</w:t>
+      </w:r>
+      <w:r>
+        <w:rPr>
+          <w:color w:val="6E6E6E"/>
+          <w:sz w:val="17"/>
+        </w:rPr>
+        <w:t xml:space="preserve">   표 0~15행</w:t>
+      </w:r>
+      <w:r>
+        <w:br/>
+      </w:r>
+      <w:r>
+        <w:rPr>
+          <w:b w:val="0"/>
+          <w:color w:val="6E6E6E"/>
+          <w:sz w:val="17"/>
+        </w:rPr>
+        <w:t>가이드: 한 줄에 기억 하나씩 적어주세요. 앞에서 이미 적은 이야기는 다시 쓰지 않아도 됩니다.</w:t>
       </w:r>
     </w:p>
     <w:tbl>
@@ -7650,8 +7789,13 @@
         <w:tblW w:w="9865" w:type="dxa"/>
       </w:tblPr>
       <w:tblGrid>
-        <w:gridCol w:w="1615"/>
-        <w:gridCol w:w="8249"/>
+        <w:gridCol w:w="1304"/>
+        <w:gridCol w:w="1304"/>
+        <w:gridCol w:w="1304"/>
+        <w:gridCol w:w="1304"/>
+        <w:gridCol w:w="1530"/>
+        <w:gridCol w:w="1383"/>
+        <w:gridCol w:w="1735"/>
       </w:tblGrid>
       <w:tr>
         <w:trPr>
@@ -7659,7 +7803,7 @@
         </w:trPr>
         <w:tc>
           <w:tcPr>
-            <w:tcW w:type="dxa" w:w="1616"/>
+            <w:tcW w:type="dxa" w:w="1304"/>
           </w:tcPr>
           <w:p>
             <w:pPr>
@@ -7672,13 +7816,23 @@
                 <w:color w:val="1A1A1A"/>
                 <w:sz w:val="17"/>
               </w:rPr>
-              <w:t>필드</w:t>
+              <w:t>제목</w:t>
+            </w:r>
+            <w:r>
+              <w:br/>
+            </w:r>
+            <w:r>
+              <w:rPr>
+                <w:color w:val="6E6E6E"/>
+                <w:sz w:val="15"/>
+              </w:rPr>
+              <w:t>단답 30자</w:t>
             </w:r>
           </w:p>
         </w:tc>
         <w:tc>
           <w:tcPr>
-            <w:tcW w:type="dxa" w:w="8249"/>
+            <w:tcW w:type="dxa" w:w="1304"/>
           </w:tcPr>
           <w:p>
             <w:pPr>
@@ -7691,7 +7845,192 @@
                 <w:color w:val="1A1A1A"/>
                 <w:sz w:val="17"/>
               </w:rPr>
-              <w:t>적는 법</w:t>
+              <w:t>내용</w:t>
+            </w:r>
+            <w:r>
+              <w:br/>
+            </w:r>
+            <w:r>
+              <w:rPr>
+                <w:color w:val="6E6E6E"/>
+                <w:sz w:val="15"/>
+              </w:rPr>
+              <w:t>서술 2~6문장</w:t>
+            </w:r>
+          </w:p>
+        </w:tc>
+        <w:tc>
+          <w:tcPr>
+            <w:tcW w:type="dxa" w:w="1304"/>
+          </w:tcPr>
+          <w:p>
+            <w:pPr>
+              <w:spacing w:after="60"/>
+              <w:shd w:val="clear" w:fill="EFEFEF"/>
+            </w:pPr>
+            <w:r>
+              <w:rPr>
+                <w:b/>
+                <w:color w:val="1A1A1A"/>
+                <w:sz w:val="17"/>
+              </w:rPr>
+              <w:t>인물</w:t>
+            </w:r>
+            <w:r>
+              <w:br/>
+            </w:r>
+            <w:r>
+              <w:rPr>
+                <w:color w:val="6E6E6E"/>
+                <w:sz w:val="15"/>
+              </w:rPr>
+              <w:t>적어둔 가족 중 한 사람, 또는 직접 적기</w:t>
+            </w:r>
+          </w:p>
+        </w:tc>
+        <w:tc>
+          <w:tcPr>
+            <w:tcW w:type="dxa" w:w="1304"/>
+          </w:tcPr>
+          <w:p>
+            <w:pPr>
+              <w:spacing w:after="60"/>
+              <w:shd w:val="clear" w:fill="EFEFEF"/>
+            </w:pPr>
+            <w:r>
+              <w:rPr>
+                <w:b/>
+                <w:color w:val="1A1A1A"/>
+                <w:sz w:val="17"/>
+              </w:rPr>
+              <w:t>시기</w:t>
+            </w:r>
+            <w:r>
+              <w:br/>
+            </w:r>
+            <w:r>
+              <w:rPr>
+                <w:color w:val="6E6E6E"/>
+                <w:sz w:val="15"/>
+              </w:rPr>
+              <w:t>연도 · 모름 허용</w:t>
+            </w:r>
+          </w:p>
+        </w:tc>
+        <w:tc>
+          <w:tcPr>
+            <w:tcW w:type="dxa" w:w="1531"/>
+          </w:tcPr>
+          <w:p>
+            <w:pPr>
+              <w:spacing w:after="60"/>
+              <w:shd w:val="clear" w:fill="EFEFEF"/>
+            </w:pPr>
+            <w:r>
+              <w:rPr>
+                <w:b/>
+                <w:color w:val="1A1A1A"/>
+                <w:sz w:val="17"/>
+              </w:rPr>
+              <w:t>감정</w:t>
+            </w:r>
+            <w:r>
+              <w:br/>
+            </w:r>
+            <w:r>
+              <w:rPr>
+                <w:color w:val="6E6E6E"/>
+                <w:sz w:val="15"/>
+              </w:rPr>
+              <w:t>단답 10자</w:t>
+            </w:r>
+            <w:r>
+              <w:br/>
+            </w:r>
+            <w:r>
+              <w:rPr>
+                <w:color w:val="6E6E6E"/>
+                <w:sz w:val="15"/>
+              </w:rPr>
+              <w:t>예: 기쁨 / 그리움 / 자부심 / 웃김 / 슬픔 / 평온</w:t>
+            </w:r>
+          </w:p>
+        </w:tc>
+        <w:tc>
+          <w:tcPr>
+            <w:tcW w:type="dxa" w:w="1383"/>
+          </w:tcPr>
+          <w:p>
+            <w:pPr>
+              <w:spacing w:after="60"/>
+              <w:shd w:val="clear" w:fill="EFEFEF"/>
+            </w:pPr>
+            <w:r>
+              <w:rPr>
+                <w:b/>
+                <w:color w:val="1A1A1A"/>
+                <w:sz w:val="17"/>
+              </w:rPr>
+              <w:t>출처</w:t>
+            </w:r>
+            <w:r>
+              <w:br/>
+            </w:r>
+            <w:r>
+              <w:rPr>
+                <w:color w:val="6E6E6E"/>
+                <w:sz w:val="15"/>
+              </w:rPr>
+              <w:t>하나 고르기</w:t>
+            </w:r>
+            <w:r>
+              <w:br/>
+            </w:r>
+            <w:r>
+              <w:rPr>
+                <w:color w:val="6E6E6E"/>
+                <w:sz w:val="15"/>
+              </w:rPr>
+              <w:t>본인 / 직접 들음 / 가족 전언 / 그랬을 것 같음</w:t>
+            </w:r>
+          </w:p>
+        </w:tc>
+        <w:tc>
+          <w:tcPr>
+            <w:tcW w:type="dxa" w:w="1735"/>
+          </w:tcPr>
+          <w:p>
+            <w:pPr>
+              <w:spacing w:after="60"/>
+              <w:shd w:val="clear" w:fill="EFEFEF"/>
+            </w:pPr>
+            <w:r>
+              <w:rPr>
+                <w:b/>
+                <w:color w:val="1A1A1A"/>
+                <w:sz w:val="17"/>
+              </w:rPr>
+              <w:t>사용 범위</w:t>
+            </w:r>
+            <w:r>
+              <w:br/>
+            </w:r>
+            <w:r>
+              <w:rPr>
+                <w:color w:val="6E6E6E"/>
+                <w:sz w:val="15"/>
+              </w:rPr>
+              <w:t>하나 고르기</w:t>
+            </w:r>
+            <w:r>
+              <w:br/>
+            </w:r>
+            <w:r>
+              <w:rPr>
+                <w:color w:val="6E6E6E"/>
+                <w:sz w:val="15"/>
+              </w:rPr>
+              <w:t>자유 / 물으면만 / 회상 참고만</w:t>
             </w:r>
           </w:p>
         </w:tc>
@@ -7702,38 +8041,72 @@
         </w:trPr>
         <w:tc>
           <w:tcPr>
-            <w:tcW w:type="dxa" w:w="1616"/>
+            <w:tcW w:type="dxa" w:w="1304"/>
           </w:tcPr>
           <w:p>
             <w:pPr>
               <w:spacing w:after="60"/>
             </w:pPr>
-            <w:r>
-              <w:rPr>
-                <w:b w:val="0"/>
-                <w:color w:val="1A1A1A"/>
-                <w:sz w:val="18"/>
-              </w:rPr>
-              <w:t>제목</w:t>
-            </w:r>
           </w:p>
         </w:tc>
         <w:tc>
           <w:tcPr>
-            <w:tcW w:type="dxa" w:w="8249"/>
+            <w:tcW w:type="dxa" w:w="1304"/>
           </w:tcPr>
           <w:p>
             <w:pPr>
               <w:spacing w:after="60"/>
             </w:pPr>
-            <w:r>
-              <w:rPr>
-                <w:b w:val="0"/>
-                <w:color w:val="1A1A1A"/>
-                <w:sz w:val="18"/>
-              </w:rPr>
-              <w:t>단답 30자</w:t>
-            </w:r>
+          </w:p>
+        </w:tc>
+        <w:tc>
+          <w:tcPr>
+            <w:tcW w:type="dxa" w:w="1304"/>
+          </w:tcPr>
+          <w:p>
+            <w:pPr>
+              <w:spacing w:after="60"/>
+            </w:pPr>
+          </w:p>
+        </w:tc>
+        <w:tc>
+          <w:tcPr>
+            <w:tcW w:type="dxa" w:w="1304"/>
+          </w:tcPr>
+          <w:p>
+            <w:pPr>
+              <w:spacing w:after="60"/>
+            </w:pPr>
+          </w:p>
+        </w:tc>
+        <w:tc>
+          <w:tcPr>
+            <w:tcW w:type="dxa" w:w="1531"/>
+          </w:tcPr>
+          <w:p>
+            <w:pPr>
+              <w:spacing w:after="60"/>
+            </w:pPr>
+          </w:p>
+        </w:tc>
+        <w:tc>
+          <w:tcPr>
+            <w:tcW w:type="dxa" w:w="1383"/>
+          </w:tcPr>
+          <w:p>
+            <w:pPr>
+              <w:spacing w:after="60"/>
+            </w:pPr>
+          </w:p>
+        </w:tc>
+        <w:tc>
+          <w:tcPr>
+            <w:tcW w:type="dxa" w:w="1735"/>
+          </w:tcPr>
+          <w:p>
+            <w:pPr>
+              <w:spacing w:after="60"/>
+            </w:pPr>
           </w:p>
         </w:tc>
       </w:tr>
@@ -7743,38 +8116,72 @@
         </w:trPr>
         <w:tc>
           <w:tcPr>
-            <w:tcW w:type="dxa" w:w="1616"/>
+            <w:tcW w:type="dxa" w:w="1304"/>
           </w:tcPr>
           <w:p>
             <w:pPr>
               <w:spacing w:after="60"/>
             </w:pPr>
-            <w:r>
-              <w:rPr>
-                <w:b w:val="0"/>
-                <w:color w:val="1A1A1A"/>
-                <w:sz w:val="18"/>
-              </w:rPr>
-              <w:t>내용</w:t>
-            </w:r>
           </w:p>
         </w:tc>
         <w:tc>
           <w:tcPr>
-            <w:tcW w:type="dxa" w:w="8249"/>
+            <w:tcW w:type="dxa" w:w="1304"/>
           </w:tcPr>
           <w:p>
             <w:pPr>
               <w:spacing w:after="60"/>
             </w:pPr>
-            <w:r>
-              <w:rPr>
-                <w:b w:val="0"/>
-                <w:color w:val="1A1A1A"/>
-                <w:sz w:val="18"/>
-              </w:rPr>
-              <w:t>서술 2~6문장</w:t>
-            </w:r>
+          </w:p>
+        </w:tc>
+        <w:tc>
+          <w:tcPr>
+            <w:tcW w:type="dxa" w:w="1304"/>
+          </w:tcPr>
+          <w:p>
+            <w:pPr>
+              <w:spacing w:after="60"/>
+            </w:pPr>
+          </w:p>
+        </w:tc>
+        <w:tc>
+          <w:tcPr>
+            <w:tcW w:type="dxa" w:w="1304"/>
+          </w:tcPr>
+          <w:p>
+            <w:pPr>
+              <w:spacing w:after="60"/>
+            </w:pPr>
+          </w:p>
+        </w:tc>
+        <w:tc>
+          <w:tcPr>
+            <w:tcW w:type="dxa" w:w="1531"/>
+          </w:tcPr>
+          <w:p>
+            <w:pPr>
+              <w:spacing w:after="60"/>
+            </w:pPr>
+          </w:p>
+        </w:tc>
+        <w:tc>
+          <w:tcPr>
+            <w:tcW w:type="dxa" w:w="1383"/>
+          </w:tcPr>
+          <w:p>
+            <w:pPr>
+              <w:spacing w:after="60"/>
+            </w:pPr>
+          </w:p>
+        </w:tc>
+        <w:tc>
+          <w:tcPr>
+            <w:tcW w:type="dxa" w:w="1735"/>
+          </w:tcPr>
+          <w:p>
+            <w:pPr>
+              <w:spacing w:after="60"/>
+            </w:pPr>
           </w:p>
         </w:tc>
       </w:tr>
@@ -7784,284 +8191,72 @@
         </w:trPr>
         <w:tc>
           <w:tcPr>
-            <w:tcW w:type="dxa" w:w="1616"/>
+            <w:tcW w:type="dxa" w:w="1304"/>
           </w:tcPr>
           <w:p>
             <w:pPr>
               <w:spacing w:after="60"/>
             </w:pPr>
-            <w:r>
-              <w:rPr>
-                <w:b w:val="0"/>
-                <w:color w:val="1A1A1A"/>
-                <w:sz w:val="18"/>
-              </w:rPr>
-              <w:t>인물</w:t>
-            </w:r>
           </w:p>
         </w:tc>
         <w:tc>
           <w:tcPr>
-            <w:tcW w:type="dxa" w:w="8249"/>
+            <w:tcW w:type="dxa" w:w="1304"/>
           </w:tcPr>
           <w:p>
             <w:pPr>
               <w:spacing w:after="60"/>
             </w:pPr>
-            <w:r>
-              <w:rPr>
-                <w:b w:val="0"/>
-                <w:color w:val="1A1A1A"/>
-                <w:sz w:val="18"/>
-              </w:rPr>
-              <w:t>적어둔 가족 중 한 사람, 또는 직접 적기</w:t>
-            </w:r>
           </w:p>
         </w:tc>
-      </w:tr>
-      <w:tr>
-        <w:trPr>
-          <w:cantSplit/>
-        </w:trPr>
         <w:tc>
           <w:tcPr>
-            <w:tcW w:type="dxa" w:w="1616"/>
+            <w:tcW w:type="dxa" w:w="1304"/>
           </w:tcPr>
           <w:p>
             <w:pPr>
               <w:spacing w:after="60"/>
             </w:pPr>
-            <w:r>
-              <w:rPr>
-                <w:b w:val="0"/>
-                <w:color w:val="1A1A1A"/>
-                <w:sz w:val="18"/>
-              </w:rPr>
-              <w:t>장소</w:t>
-            </w:r>
           </w:p>
         </w:tc>
         <w:tc>
           <w:tcPr>
-            <w:tcW w:type="dxa" w:w="8249"/>
+            <w:tcW w:type="dxa" w:w="1304"/>
           </w:tcPr>
           <w:p>
             <w:pPr>
               <w:spacing w:after="60"/>
             </w:pPr>
-            <w:r>
-              <w:rPr>
-                <w:b w:val="0"/>
-                <w:color w:val="1A1A1A"/>
-                <w:sz w:val="18"/>
-              </w:rPr>
-              <w:t>단답 20자</w:t>
-            </w:r>
           </w:p>
         </w:tc>
-      </w:tr>
-      <w:tr>
-        <w:trPr>
-          <w:cantSplit/>
-        </w:trPr>
         <w:tc>
           <w:tcPr>
-            <w:tcW w:type="dxa" w:w="1616"/>
+            <w:tcW w:type="dxa" w:w="1531"/>
           </w:tcPr>
           <w:p>
             <w:pPr>
               <w:spacing w:after="60"/>
             </w:pPr>
-            <w:r>
-              <w:rPr>
-                <w:b w:val="0"/>
-                <w:color w:val="1A1A1A"/>
-                <w:sz w:val="18"/>
-              </w:rPr>
-              <w:t>시기</w:t>
-            </w:r>
           </w:p>
         </w:tc>
         <w:tc>
           <w:tcPr>
-            <w:tcW w:type="dxa" w:w="8249"/>
+            <w:tcW w:type="dxa" w:w="1383"/>
           </w:tcPr>
           <w:p>
             <w:pPr>
               <w:spacing w:after="60"/>
             </w:pPr>
-            <w:r>
-              <w:rPr>
-                <w:b w:val="0"/>
-                <w:color w:val="1A1A1A"/>
-                <w:sz w:val="18"/>
-              </w:rPr>
-              <w:t>연도(모름 허용) + 정확함 / 대략 / 모름</w:t>
-            </w:r>
           </w:p>
         </w:tc>
-      </w:tr>
-      <w:tr>
-        <w:trPr>
-          <w:cantSplit/>
-        </w:trPr>
         <w:tc>
           <w:tcPr>
-            <w:tcW w:type="dxa" w:w="1616"/>
+            <w:tcW w:type="dxa" w:w="1735"/>
           </w:tcPr>
           <w:p>
             <w:pPr>
               <w:spacing w:after="60"/>
             </w:pPr>
-            <w:r>
-              <w:rPr>
-                <w:b w:val="0"/>
-                <w:color w:val="1A1A1A"/>
-                <w:sz w:val="18"/>
-              </w:rPr>
-              <w:t>감정</w:t>
-            </w:r>
-          </w:p>
-        </w:tc>
-        <w:tc>
-          <w:tcPr>
-            <w:tcW w:type="dxa" w:w="8249"/>
-          </w:tcPr>
-          <w:p>
-            <w:pPr>
-              <w:spacing w:after="60"/>
-            </w:pPr>
-            <w:r>
-              <w:rPr>
-                <w:b w:val="0"/>
-                <w:color w:val="1A1A1A"/>
-                <w:sz w:val="18"/>
-              </w:rPr>
-              <w:t>기쁨 / 그리움 / 자부심 / 웃김 / 슬픔 / 평온 / 모름</w:t>
-            </w:r>
-          </w:p>
-        </w:tc>
-      </w:tr>
-      <w:tr>
-        <w:trPr>
-          <w:cantSplit/>
-        </w:trPr>
-        <w:tc>
-          <w:tcPr>
-            <w:tcW w:type="dxa" w:w="1616"/>
-          </w:tcPr>
-          <w:p>
-            <w:pPr>
-              <w:spacing w:after="60"/>
-            </w:pPr>
-            <w:r>
-              <w:rPr>
-                <w:b w:val="0"/>
-                <w:color w:val="1A1A1A"/>
-                <w:sz w:val="18"/>
-              </w:rPr>
-              <w:t>출처</w:t>
-            </w:r>
-          </w:p>
-        </w:tc>
-        <w:tc>
-          <w:tcPr>
-            <w:tcW w:type="dxa" w:w="8249"/>
-          </w:tcPr>
-          <w:p>
-            <w:pPr>
-              <w:spacing w:after="60"/>
-            </w:pPr>
-            <w:r>
-              <w:rPr>
-                <w:b w:val="0"/>
-                <w:color w:val="1A1A1A"/>
-                <w:sz w:val="18"/>
-              </w:rPr>
-              <w:t>본인 / 직접 들음 / 가족 전언 / 그랬을 것 같음</w:t>
-            </w:r>
-          </w:p>
-        </w:tc>
-      </w:tr>
-      <w:tr>
-        <w:trPr>
-          <w:cantSplit/>
-        </w:trPr>
-        <w:tc>
-          <w:tcPr>
-            <w:tcW w:type="dxa" w:w="1616"/>
-          </w:tcPr>
-          <w:p>
-            <w:pPr>
-              <w:spacing w:after="60"/>
-            </w:pPr>
-            <w:r>
-              <w:rPr>
-                <w:b w:val="0"/>
-                <w:color w:val="1A1A1A"/>
-                <w:sz w:val="18"/>
-              </w:rPr>
-              <w:t>확실성</w:t>
-            </w:r>
-          </w:p>
-        </w:tc>
-        <w:tc>
-          <w:tcPr>
-            <w:tcW w:type="dxa" w:w="8249"/>
-          </w:tcPr>
-          <w:p>
-            <w:pPr>
-              <w:spacing w:after="60"/>
-            </w:pPr>
-            <w:r>
-              <w:rPr>
-                <w:b w:val="0"/>
-                <w:color w:val="1A1A1A"/>
-                <w:sz w:val="18"/>
-              </w:rPr>
-              <w:t>확실 / 대략 / 추정</w:t>
-            </w:r>
-          </w:p>
-        </w:tc>
-      </w:tr>
-      <w:tr>
-        <w:trPr>
-          <w:cantSplit/>
-        </w:trPr>
-        <w:tc>
-          <w:tcPr>
-            <w:tcW w:type="dxa" w:w="1616"/>
-          </w:tcPr>
-          <w:p>
-            <w:pPr>
-              <w:spacing w:after="60"/>
-            </w:pPr>
-            <w:r>
-              <w:rPr>
-                <w:b w:val="0"/>
-                <w:color w:val="1A1A1A"/>
-                <w:sz w:val="18"/>
-              </w:rPr>
-              <w:t>사용 범위</w:t>
-            </w:r>
-          </w:p>
-        </w:tc>
-        <w:tc>
-          <w:tcPr>
-            <w:tcW w:type="dxa" w:w="8249"/>
-          </w:tcPr>
-          <w:p>
-            <w:pPr>
-              <w:spacing w:after="60"/>
-            </w:pPr>
-            <w:r>
-              <w:rPr>
-                <w:b w:val="0"/>
-                <w:color w:val="1A1A1A"/>
-                <w:sz w:val="18"/>
-              </w:rPr>
-              <w:t>자유 / 물으면만 / 회상 참고만</w:t>
-            </w:r>
           </w:p>
         </w:tc>
       </w:tr>
@@ -8096,18 +8291,18 @@
     </w:p>
     <w:p>
       <w:pPr>
-        <w:keepNext w:val="0"/>
-        <w:keepLines/>
-        <w:spacing w:before="0" w:after="80" w:line="312" w:lineRule="auto"/>
-        <w:ind w:left="0"/>
+        <w:keepNext/>
+        <w:keepLines/>
+        <w:spacing w:before="0" w:after="60" w:line="312" w:lineRule="auto"/>
+        <w:ind w:left="340"/>
       </w:pPr>
       <w:r>
         <w:rPr>
           <w:b w:val="0"/>
           <w:color w:val="6E6E6E"/>
-          <w:sz w:val="18"/>
-        </w:rPr>
-        <w:t>태도를 고르고, 실제 하실 법한 말 한 줄을 따옴표 그대로 적어주세요. 말은 비워도 됩니다.</w:t>
+          <w:sz w:val="17"/>
+        </w:rPr>
+        <w:t>가이드: 태도를 고르고, 실제 하실 법한 말을 따옴표 그대로 적어주세요. 말은 비워도 됩니다.</w:t>
       </w:r>
     </w:p>
     <w:p>
@@ -8133,6 +8328,13 @@
         </w:rPr>
         <w:t>누가 "보고 싶어요"라고 하면</w:t>
       </w:r>
+      <w:r>
+        <w:rPr>
+          <w:color w:val="6E6E6E"/>
+          <w:sz w:val="17"/>
+        </w:rPr>
+        <w:t xml:space="preserve">   하나 선택</w:t>
+      </w:r>
     </w:p>
     <w:p>
       <w:pPr>
@@ -8160,10 +8362,17 @@
       <w:r>
         <w:rPr>
           <w:b w:val="0"/>
-          <w:color w:val="1A1A1A"/>
+          <w:color w:val="1F4E79"/>
           <w:sz w:val="20"/>
         </w:rPr>
-        <w:t>말 한 줄</w:t>
+        <w:t xml:space="preserve">실제 하실 법한 말을 한 줄 적어주세요.  </w:t>
+      </w:r>
+      <w:r>
+        <w:rPr>
+          <w:color w:val="6E6E6E"/>
+          <w:sz w:val="17"/>
+        </w:rPr>
+        <w:t>단답 30자 · 선택</w:t>
       </w:r>
     </w:p>
     <w:p>
@@ -8206,6 +8415,13 @@
         </w:rPr>
         <w:t>"너무 힘들어요"라고 하면</w:t>
       </w:r>
+      <w:r>
+        <w:rPr>
+          <w:color w:val="6E6E6E"/>
+          <w:sz w:val="17"/>
+        </w:rPr>
+        <w:t xml:space="preserve">   하나 선택</w:t>
+      </w:r>
     </w:p>
     <w:p>
       <w:pPr>
@@ -8249,10 +8465,17 @@
       <w:r>
         <w:rPr>
           <w:b w:val="0"/>
-          <w:color w:val="1A1A1A"/>
+          <w:color w:val="1F4E79"/>
           <w:sz w:val="20"/>
         </w:rPr>
-        <w:t>말 한 줄</w:t>
+        <w:t xml:space="preserve">실제 하실 법한 말을 한 줄 적어주세요.  </w:t>
+      </w:r>
+      <w:r>
+        <w:rPr>
+          <w:color w:val="6E6E6E"/>
+          <w:sz w:val="17"/>
+        </w:rPr>
+        <w:t>단답 30자 · 선택</w:t>
       </w:r>
     </w:p>
     <w:p>
@@ -8295,6 +8518,13 @@
         </w:rPr>
         <w:t>"좋은 일이 생겼어요!"라고 하면</w:t>
       </w:r>
+      <w:r>
+        <w:rPr>
+          <w:color w:val="6E6E6E"/>
+          <w:sz w:val="17"/>
+        </w:rPr>
+        <w:t xml:space="preserve">   하나 선택</w:t>
+      </w:r>
     </w:p>
     <w:p>
       <w:pPr>
@@ -8322,10 +8552,17 @@
       <w:r>
         <w:rPr>
           <w:b w:val="0"/>
-          <w:color w:val="1A1A1A"/>
+          <w:color w:val="1F4E79"/>
           <w:sz w:val="20"/>
         </w:rPr>
-        <w:t>말 한 줄</w:t>
+        <w:t xml:space="preserve">실제 하실 법한 말을 한 줄 적어주세요.  </w:t>
+      </w:r>
+      <w:r>
+        <w:rPr>
+          <w:color w:val="6E6E6E"/>
+          <w:sz w:val="17"/>
+        </w:rPr>
+        <w:t>단답 30자 · 선택</w:t>
       </w:r>
     </w:p>
     <w:p>
@@ -8369,6 +8606,13 @@
         <w:t>가족이 아프다고 하면</w:t>
       </w:r>
       <w:r>
+        <w:rPr>
+          <w:color w:val="6E6E6E"/>
+          <w:sz w:val="17"/>
+        </w:rPr>
+        <w:t xml:space="preserve">   하나 선택</w:t>
+      </w:r>
+      <w:r>
         <w:br/>
       </w:r>
       <w:r>
@@ -8406,10 +8650,17 @@
       <w:r>
         <w:rPr>
           <w:b w:val="0"/>
-          <w:color w:val="1A1A1A"/>
+          <w:color w:val="1F4E79"/>
           <w:sz w:val="20"/>
         </w:rPr>
-        <w:t>말 한 줄</w:t>
+        <w:t xml:space="preserve">실제 하실 법한 말을 한 줄 적어주세요.  </w:t>
+      </w:r>
+      <w:r>
+        <w:rPr>
+          <w:color w:val="6E6E6E"/>
+          <w:sz w:val="17"/>
+        </w:rPr>
+        <w:t>단답 30자 · 선택</w:t>
       </w:r>
     </w:p>
     <w:p>
@@ -8452,6 +8703,13 @@
         </w:rPr>
         <w:t>가족끼리 다퉜다는 걸 알면</w:t>
       </w:r>
+      <w:r>
+        <w:rPr>
+          <w:color w:val="6E6E6E"/>
+          <w:sz w:val="17"/>
+        </w:rPr>
+        <w:t xml:space="preserve">   하나 선택</w:t>
+      </w:r>
     </w:p>
     <w:p>
       <w:pPr>
@@ -8495,10 +8753,120 @@
       <w:r>
         <w:rPr>
           <w:b w:val="0"/>
+          <w:color w:val="1F4E79"/>
+          <w:sz w:val="20"/>
+        </w:rPr>
+        <w:t xml:space="preserve">실제 하실 법한 말을 한 줄 적어주세요.  </w:t>
+      </w:r>
+      <w:r>
+        <w:rPr>
+          <w:color w:val="6E6E6E"/>
+          <w:sz w:val="17"/>
+        </w:rPr>
+        <w:t>단답 30자 · 선택</w:t>
+      </w:r>
+    </w:p>
+    <w:p>
+      <w:pPr>
+        <w:spacing w:before="0" w:after="120" w:line="276" w:lineRule="auto"/>
+        <w:ind w:left="227"/>
+        <w:keepNext/>
+        <w:keepLines/>
+        <w:pBdr>
+          <w:bottom w:val="single" w:sz="6" w:space="4" w:color="9A9A9A"/>
+        </w:pBdr>
+      </w:pPr>
+      <w:r>
+        <w:rPr>
+          <w:sz w:val="20"/>
+        </w:rPr>
+        <w:t xml:space="preserve"> </w:t>
+      </w:r>
+    </w:p>
+    <w:p>
+      <w:pPr>
+        <w:spacing w:before="300" w:after="100" w:line="300" w:lineRule="auto"/>
+        <w:ind w:left="113" w:right="113"/>
+        <w:keepNext/>
+        <w:keepLines/>
+        <w:shd w:val="clear" w:fill="F1F5F9"/>
+      </w:pPr>
+      <w:r>
+        <w:rPr>
+          <w:b/>
+          <w:sz w:val="21"/>
+        </w:rPr>
+        <w:t xml:space="preserve">M8-06  </w:t>
+      </w:r>
+      <w:r>
+        <w:rPr>
+          <w:b/>
+          <w:color w:val="1A1A1A"/>
+          <w:sz w:val="21"/>
+        </w:rPr>
+        <w:t>공부나 일 걱정을 털어놓으면</w:t>
+      </w:r>
+      <w:r>
+        <w:rPr>
+          <w:color w:val="6E6E6E"/>
+          <w:sz w:val="17"/>
+        </w:rPr>
+        <w:t xml:space="preserve">   하나 선택</w:t>
+      </w:r>
+    </w:p>
+    <w:p>
+      <w:pPr>
+        <w:keepNext/>
+        <w:keepLines/>
+        <w:spacing w:before="0" w:after="80" w:line="312" w:lineRule="auto"/>
+        <w:ind w:left="227"/>
+      </w:pPr>
+      <w:r>
+        <w:rPr>
+          <w:b w:val="0"/>
           <w:color w:val="1A1A1A"/>
           <w:sz w:val="20"/>
         </w:rPr>
-        <w:t>말 한 줄</w:t>
+        <w:t>□ 걱정 말라고 안심시킨다  □ 열심히 하라고 독려한다  □ 구체적으로 조언한다</w:t>
+      </w:r>
+    </w:p>
+    <w:p>
+      <w:pPr>
+        <w:keepNext/>
+        <w:keepLines/>
+        <w:spacing w:before="0" w:after="80" w:line="312" w:lineRule="auto"/>
+        <w:ind w:left="227"/>
+      </w:pPr>
+      <w:r>
+        <w:rPr>
+          <w:b w:val="0"/>
+          <w:color w:val="1A1A1A"/>
+          <w:sz w:val="20"/>
+        </w:rPr>
+        <w:t>□ 건강부터 챙기라고 한다  □ 직접 입력 → ____________________</w:t>
+      </w:r>
+    </w:p>
+    <w:p>
+      <w:pPr>
+        <w:keepNext/>
+        <w:keepLines/>
+        <w:spacing w:before="0" w:after="80" w:line="312" w:lineRule="auto"/>
+        <w:ind w:left="227"/>
+      </w:pPr>
+      <w:r>
+        <w:rPr>
+          <w:b w:val="0"/>
+          <w:color w:val="1F4E79"/>
+          <w:sz w:val="20"/>
+        </w:rPr>
+        <w:t xml:space="preserve">실제 하실 법한 말을 한 줄 적어주세요.  </w:t>
+      </w:r>
+      <w:r>
+        <w:rPr>
+          <w:color w:val="6E6E6E"/>
+          <w:sz w:val="17"/>
+        </w:rPr>
+        <w:t>단답 30자 · 선택</w:t>
       </w:r>
     </w:p>
     <w:p>
@@ -8531,7 +8899,7 @@
           <w:b/>
           <w:sz w:val="21"/>
         </w:rPr>
-        <w:t xml:space="preserve">M8-06  </w:t>
+        <w:t xml:space="preserve">M8-07  </w:t>
       </w:r>
       <w:r>
         <w:rPr>
@@ -8539,7 +8907,14 @@
           <w:color w:val="1A1A1A"/>
           <w:sz w:val="21"/>
         </w:rPr>
-        <w:t>공부나 일 걱정을 털어놓으면</w:t>
+        <w:t>결혼이나 연애 고민을 이야기하면</w:t>
+      </w:r>
+      <w:r>
+        <w:rPr>
+          <w:color w:val="6E6E6E"/>
+          <w:sz w:val="17"/>
+        </w:rPr>
+        <w:t xml:space="preserve">   하나 선택</w:t>
       </w:r>
     </w:p>
     <w:p>
@@ -8555,7 +8930,175 @@
           <w:color w:val="1A1A1A"/>
           <w:sz w:val="20"/>
         </w:rPr>
-        <w:t>□ 걱정 말라고 안심시킨다  □ 열심히 하라고 독려한다  □ 구체적으로 조언한다</w:t>
+        <w:t>□ 믿고 잘하라고 한다  □ 신중하라고 한다  □ 캐묻지 않고 응원한다  □ 직접 입력 → ____________________</w:t>
+      </w:r>
+    </w:p>
+    <w:p>
+      <w:pPr>
+        <w:keepNext/>
+        <w:keepLines/>
+        <w:spacing w:before="0" w:after="80" w:line="312" w:lineRule="auto"/>
+        <w:ind w:left="227"/>
+      </w:pPr>
+      <w:r>
+        <w:rPr>
+          <w:b w:val="0"/>
+          <w:color w:val="1F4E79"/>
+          <w:sz w:val="20"/>
+        </w:rPr>
+        <w:t xml:space="preserve">실제 하실 법한 말을 한 줄 적어주세요.  </w:t>
+      </w:r>
+      <w:r>
+        <w:rPr>
+          <w:color w:val="6E6E6E"/>
+          <w:sz w:val="17"/>
+        </w:rPr>
+        <w:t>단답 30자 · 선택</w:t>
+      </w:r>
+    </w:p>
+    <w:p>
+      <w:pPr>
+        <w:spacing w:before="0" w:after="120" w:line="276" w:lineRule="auto"/>
+        <w:ind w:left="227"/>
+        <w:keepNext w:val="0"/>
+        <w:keepLines/>
+        <w:pBdr>
+          <w:bottom w:val="single" w:sz="6" w:space="4" w:color="9A9A9A"/>
+        </w:pBdr>
+      </w:pPr>
+      <w:r>
+        <w:rPr>
+          <w:sz w:val="20"/>
+        </w:rPr>
+        <w:t xml:space="preserve"> </w:t>
+      </w:r>
+    </w:p>
+    <w:p>
+      <w:pPr>
+        <w:spacing w:before="300" w:after="100" w:line="300" w:lineRule="auto"/>
+        <w:ind w:left="113" w:right="113"/>
+        <w:keepNext/>
+        <w:keepLines/>
+        <w:shd w:val="clear" w:fill="F1F5F9"/>
+      </w:pPr>
+      <w:r>
+        <w:rPr>
+          <w:b/>
+          <w:sz w:val="21"/>
+        </w:rPr>
+        <w:t xml:space="preserve">M8-08  </w:t>
+      </w:r>
+      <w:r>
+        <w:rPr>
+          <w:b/>
+          <w:color w:val="1A1A1A"/>
+          <w:sz w:val="21"/>
+        </w:rPr>
+        <w:t>모르는 것을 물으면</w:t>
+      </w:r>
+      <w:r>
+        <w:rPr>
+          <w:color w:val="6E6E6E"/>
+          <w:sz w:val="17"/>
+        </w:rPr>
+        <w:t xml:space="preserve">   단답 30자</w:t>
+      </w:r>
+      <w:r>
+        <w:br/>
+      </w:r>
+      <w:r>
+        <w:rPr>
+          <w:b w:val="0"/>
+          <w:color w:val="B03A2B"/>
+          <w:sz w:val="17"/>
+        </w:rPr>
+        <w:t>예: "그건 내가 잘 모르겠구나"</w:t>
+      </w:r>
+      <w:r>
+        <w:br/>
+      </w:r>
+      <w:r>
+        <w:rPr>
+          <w:b w:val="0"/>
+          <w:color w:val="6E6E6E"/>
+          <w:sz w:val="17"/>
+        </w:rPr>
+        <w:t>가이드: "기억 안 나" 계열은 쓸 수 없어요.</w:t>
+      </w:r>
+    </w:p>
+    <w:p>
+      <w:pPr>
+        <w:keepNext/>
+        <w:keepLines/>
+        <w:spacing w:before="0" w:after="80" w:line="312" w:lineRule="auto"/>
+        <w:ind w:left="227"/>
+      </w:pPr>
+      <w:r>
+        <w:rPr>
+          <w:b w:val="0"/>
+          <w:color w:val="1F4E79"/>
+          <w:sz w:val="20"/>
+        </w:rPr>
+        <w:t>그분다운 "모르겠다" 표현을 한 줄 적어주세요.</w:t>
+      </w:r>
+    </w:p>
+    <w:p>
+      <w:pPr>
+        <w:spacing w:before="0" w:after="120" w:line="276" w:lineRule="auto"/>
+        <w:ind w:left="227"/>
+        <w:keepNext/>
+        <w:keepLines/>
+        <w:pBdr>
+          <w:bottom w:val="single" w:sz="6" w:space="4" w:color="9A9A9A"/>
+        </w:pBdr>
+      </w:pPr>
+      <w:r>
+        <w:rPr>
+          <w:sz w:val="20"/>
+        </w:rPr>
+        <w:t xml:space="preserve"> </w:t>
+      </w:r>
+    </w:p>
+    <w:p>
+      <w:pPr>
+        <w:spacing w:before="300" w:after="100" w:line="300" w:lineRule="auto"/>
+        <w:ind w:left="113" w:right="113"/>
+        <w:keepNext/>
+        <w:keepLines/>
+        <w:shd w:val="clear" w:fill="F1F5F9"/>
+      </w:pPr>
+      <w:r>
+        <w:rPr>
+          <w:b/>
+          <w:sz w:val="21"/>
+        </w:rPr>
+        <w:t xml:space="preserve">M8-09  </w:t>
+      </w:r>
+      <w:r>
+        <w:rPr>
+          <w:b/>
+          <w:color w:val="1A1A1A"/>
+          <w:sz w:val="21"/>
+        </w:rPr>
+        <w:t>돈·상속·정치 같은 주제를 물으면</w:t>
+      </w:r>
+      <w:r>
+        <w:rPr>
+          <w:color w:val="6E6E6E"/>
+          <w:sz w:val="17"/>
+        </w:rPr>
+        <w:t xml:space="preserve">   하나 선택</w:t>
+      </w:r>
+      <w:r>
+        <w:br/>
+      </w:r>
+      <w:r>
+        <w:rPr>
+          <w:b w:val="0"/>
+          <w:color w:val="6E6E6E"/>
+          <w:sz w:val="17"/>
+        </w:rPr>
+        <w:t>가이드: 여기는 "그럴 때 뭐라고 하는지"만 적어주세요.</w:t>
       </w:r>
     </w:p>
     <w:p>
@@ -8571,7 +9114,78 @@
           <w:color w:val="1A1A1A"/>
           <w:sz w:val="20"/>
         </w:rPr>
-        <w:t>□ 건강부터 챙기라고 한다  □ 직접 입력 → ____________________</w:t>
+        <w:t>□ 짧게 넘기고 화제를 돌린다  □ 그런 얘기는 안 한다고 말한다  □ 원칙 한마디만 한다  □ 직접 입력 → ____________________</w:t>
+      </w:r>
+    </w:p>
+    <w:p>
+      <w:pPr>
+        <w:keepNext/>
+        <w:keepLines/>
+        <w:spacing w:before="0" w:after="80" w:line="312" w:lineRule="auto"/>
+        <w:ind w:left="227"/>
+      </w:pPr>
+      <w:r>
+        <w:rPr>
+          <w:b w:val="0"/>
+          <w:color w:val="1F4E79"/>
+          <w:sz w:val="20"/>
+        </w:rPr>
+        <w:t xml:space="preserve">실제 하실 법한 말을 한 줄 적어주세요.  </w:t>
+      </w:r>
+      <w:r>
+        <w:rPr>
+          <w:color w:val="6E6E6E"/>
+          <w:sz w:val="17"/>
+        </w:rPr>
+        <w:t>단답 30자 · 선택</w:t>
+      </w:r>
+    </w:p>
+    <w:p>
+      <w:pPr>
+        <w:spacing w:before="0" w:after="120" w:line="276" w:lineRule="auto"/>
+        <w:ind w:left="227"/>
+        <w:keepNext w:val="0"/>
+        <w:keepLines/>
+        <w:pBdr>
+          <w:bottom w:val="single" w:sz="6" w:space="4" w:color="9A9A9A"/>
+        </w:pBdr>
+      </w:pPr>
+      <w:r>
+        <w:rPr>
+          <w:sz w:val="20"/>
+        </w:rPr>
+        <w:t xml:space="preserve"> </w:t>
+      </w:r>
+    </w:p>
+    <w:p>
+      <w:pPr>
+        <w:spacing w:before="300" w:after="100" w:line="300" w:lineRule="auto"/>
+        <w:ind w:left="113" w:right="113"/>
+        <w:keepNext/>
+        <w:keepLines/>
+        <w:shd w:val="clear" w:fill="F1F5F9"/>
+      </w:pPr>
+      <w:r>
+        <w:rPr>
+          <w:b/>
+          <w:sz w:val="21"/>
+        </w:rPr>
+        <w:t xml:space="preserve">M8-10  </w:t>
+      </w:r>
+      <w:r>
+        <w:rPr>
+          <w:b/>
+          <w:color w:val="1A1A1A"/>
+          <w:sz w:val="21"/>
+        </w:rPr>
+        <w:t>사용자가 미안함이나 죄책감을 말하면 ("그때 곁에 못 있어서 죄송해요", "더 잘해드릴걸")</w:t>
+      </w:r>
+      <w:r>
+        <w:rPr>
+          <w:color w:val="6E6E6E"/>
+          <w:sz w:val="17"/>
+        </w:rPr>
+        <w:t xml:space="preserve">   하나 선택</w:t>
       </w:r>
     </w:p>
     <w:p>
@@ -8587,7 +9201,46 @@
           <w:color w:val="1A1A1A"/>
           <w:sz w:val="20"/>
         </w:rPr>
-        <w:t>말 한 줄</w:t>
+        <w:t>□ 괜찮다고 다독이고 미안해할 것 없다고 한다  □ 네가 해준 것으로 충분했다고 말한다</w:t>
+      </w:r>
+    </w:p>
+    <w:p>
+      <w:pPr>
+        <w:keepNext/>
+        <w:keepLines/>
+        <w:spacing w:before="0" w:after="80" w:line="312" w:lineRule="auto"/>
+        <w:ind w:left="227"/>
+      </w:pPr>
+      <w:r>
+        <w:rPr>
+          <w:b w:val="0"/>
+          <w:color w:val="1A1A1A"/>
+          <w:sz w:val="20"/>
+        </w:rPr>
+        <w:t>□ 그 얘기는 그만하자며 안부로 돌린다  □ 직접 입력 → ____________________</w:t>
+      </w:r>
+    </w:p>
+    <w:p>
+      <w:pPr>
+        <w:keepNext/>
+        <w:keepLines/>
+        <w:spacing w:before="0" w:after="80" w:line="312" w:lineRule="auto"/>
+        <w:ind w:left="227"/>
+      </w:pPr>
+      <w:r>
+        <w:rPr>
+          <w:b w:val="0"/>
+          <w:color w:val="1F4E79"/>
+          <w:sz w:val="20"/>
+        </w:rPr>
+        <w:t xml:space="preserve">실제 하실 법한 말을 한 줄 적어주세요.  </w:t>
+      </w:r>
+      <w:r>
+        <w:rPr>
+          <w:color w:val="6E6E6E"/>
+          <w:sz w:val="17"/>
+        </w:rPr>
+        <w:t>단답 30자 · 선택</w:t>
       </w:r>
     </w:p>
     <w:p>
@@ -8609,332 +9262,7 @@
     </w:p>
     <w:p>
       <w:pPr>
-        <w:spacing w:before="300" w:after="100" w:line="300" w:lineRule="auto"/>
-        <w:ind w:left="113" w:right="113"/>
         <w:keepNext/>
-        <w:keepLines/>
-        <w:shd w:val="clear" w:fill="F1F5F9"/>
-      </w:pPr>
-      <w:r>
-        <w:rPr>
-          <w:b/>
-          <w:sz w:val="21"/>
-        </w:rPr>
-        <w:t xml:space="preserve">M8-07  </w:t>
-      </w:r>
-      <w:r>
-        <w:rPr>
-          <w:b/>
-          <w:color w:val="1A1A1A"/>
-          <w:sz w:val="21"/>
-        </w:rPr>
-        <w:t>결혼이나 연애 고민을 이야기하면</w:t>
-      </w:r>
-    </w:p>
-    <w:p>
-      <w:pPr>
-        <w:keepNext/>
-        <w:keepLines/>
-        <w:spacing w:before="0" w:after="80" w:line="312" w:lineRule="auto"/>
-        <w:ind w:left="227"/>
-      </w:pPr>
-      <w:r>
-        <w:rPr>
-          <w:b w:val="0"/>
-          <w:color w:val="1A1A1A"/>
-          <w:sz w:val="20"/>
-        </w:rPr>
-        <w:t>□ 믿고 잘하라고 한다  □ 신중하라고 한다  □ 캐묻지 않고 응원한다  □ 직접 입력 → ____________________</w:t>
-      </w:r>
-    </w:p>
-    <w:p>
-      <w:pPr>
-        <w:keepNext/>
-        <w:keepLines/>
-        <w:spacing w:before="0" w:after="80" w:line="312" w:lineRule="auto"/>
-        <w:ind w:left="227"/>
-      </w:pPr>
-      <w:r>
-        <w:rPr>
-          <w:b w:val="0"/>
-          <w:color w:val="1A1A1A"/>
-          <w:sz w:val="20"/>
-        </w:rPr>
-        <w:t>말 한 줄</w:t>
-      </w:r>
-    </w:p>
-    <w:p>
-      <w:pPr>
-        <w:spacing w:before="0" w:after="120" w:line="276" w:lineRule="auto"/>
-        <w:ind w:left="227"/>
-        <w:keepNext w:val="0"/>
-        <w:keepLines/>
-        <w:pBdr>
-          <w:bottom w:val="single" w:sz="6" w:space="4" w:color="9A9A9A"/>
-        </w:pBdr>
-      </w:pPr>
-      <w:r>
-        <w:rPr>
-          <w:sz w:val="20"/>
-        </w:rPr>
-        <w:t xml:space="preserve"> </w:t>
-      </w:r>
-    </w:p>
-    <w:p>
-      <w:pPr>
-        <w:spacing w:before="300" w:after="100" w:line="300" w:lineRule="auto"/>
-        <w:ind w:left="113" w:right="113"/>
-        <w:keepNext/>
-        <w:keepLines/>
-        <w:shd w:val="clear" w:fill="F1F5F9"/>
-      </w:pPr>
-      <w:r>
-        <w:rPr>
-          <w:b/>
-          <w:sz w:val="21"/>
-        </w:rPr>
-        <w:t xml:space="preserve">M8-08  </w:t>
-      </w:r>
-      <w:r>
-        <w:rPr>
-          <w:b/>
-          <w:color w:val="1A1A1A"/>
-          <w:sz w:val="21"/>
-        </w:rPr>
-        <w:t>모르는 것을 물으면</w:t>
-      </w:r>
-      <w:r>
-        <w:br/>
-      </w:r>
-      <w:r>
-        <w:rPr>
-          <w:b w:val="0"/>
-          <w:color w:val="B03A2B"/>
-          <w:sz w:val="17"/>
-        </w:rPr>
-        <w:t>예: "그건 내가 잘 모르겠구나"</w:t>
-      </w:r>
-      <w:r>
-        <w:br/>
-      </w:r>
-      <w:r>
-        <w:rPr>
-          <w:b w:val="0"/>
-          <w:color w:val="6E6E6E"/>
-          <w:sz w:val="17"/>
-        </w:rPr>
-        <w:t>가이드: "기억 안 나" 계열은 쓸 수 없어요.</w:t>
-      </w:r>
-    </w:p>
-    <w:p>
-      <w:pPr>
-        <w:keepNext/>
-        <w:keepLines/>
-        <w:spacing w:before="0" w:after="80" w:line="312" w:lineRule="auto"/>
-        <w:ind w:left="227"/>
-      </w:pPr>
-      <w:r>
-        <w:rPr>
-          <w:b w:val="0"/>
-          <w:color w:val="1A1A1A"/>
-          <w:sz w:val="20"/>
-        </w:rPr>
-        <w:t>그분다운 "모르겠다" 표현</w:t>
-      </w:r>
-    </w:p>
-    <w:p>
-      <w:pPr>
-        <w:spacing w:before="0" w:after="120" w:line="276" w:lineRule="auto"/>
-        <w:ind w:left="227"/>
-        <w:keepNext w:val="0"/>
-        <w:keepLines/>
-        <w:pBdr>
-          <w:bottom w:val="single" w:sz="6" w:space="4" w:color="9A9A9A"/>
-        </w:pBdr>
-      </w:pPr>
-      <w:r>
-        <w:rPr>
-          <w:sz w:val="20"/>
-        </w:rPr>
-        <w:t xml:space="preserve"> </w:t>
-      </w:r>
-    </w:p>
-    <w:p>
-      <w:pPr>
-        <w:spacing w:before="300" w:after="100" w:line="300" w:lineRule="auto"/>
-        <w:ind w:left="113" w:right="113"/>
-        <w:keepNext/>
-        <w:keepLines/>
-        <w:shd w:val="clear" w:fill="F1F5F9"/>
-      </w:pPr>
-      <w:r>
-        <w:rPr>
-          <w:b/>
-          <w:sz w:val="21"/>
-        </w:rPr>
-        <w:t xml:space="preserve">M8-09  </w:t>
-      </w:r>
-      <w:r>
-        <w:rPr>
-          <w:b/>
-          <w:color w:val="1A1A1A"/>
-          <w:sz w:val="21"/>
-        </w:rPr>
-        <w:t>돈·상속·정치 같은 주제를 물으면</w:t>
-      </w:r>
-      <w:r>
-        <w:br/>
-      </w:r>
-      <w:r>
-        <w:rPr>
-          <w:b w:val="0"/>
-          <w:color w:val="6E6E6E"/>
-          <w:sz w:val="17"/>
-        </w:rPr>
-        <w:t>가이드: 여기는 "그럴 때 뭐라고 하는지"만 적어주세요.</w:t>
-      </w:r>
-    </w:p>
-    <w:p>
-      <w:pPr>
-        <w:keepNext/>
-        <w:keepLines/>
-        <w:spacing w:before="0" w:after="80" w:line="312" w:lineRule="auto"/>
-        <w:ind w:left="227"/>
-      </w:pPr>
-      <w:r>
-        <w:rPr>
-          <w:b w:val="0"/>
-          <w:color w:val="1A1A1A"/>
-          <w:sz w:val="20"/>
-        </w:rPr>
-        <w:t>□ 짧게 넘기고 화제를 돌린다  □ 그런 얘기는 안 한다고 말한다  □ 원칙 한마디만 한다  □ 직접 입력 → ____________________</w:t>
-      </w:r>
-    </w:p>
-    <w:p>
-      <w:pPr>
-        <w:keepNext/>
-        <w:keepLines/>
-        <w:spacing w:before="0" w:after="80" w:line="312" w:lineRule="auto"/>
-        <w:ind w:left="227"/>
-      </w:pPr>
-      <w:r>
-        <w:rPr>
-          <w:b w:val="0"/>
-          <w:color w:val="1A1A1A"/>
-          <w:sz w:val="20"/>
-        </w:rPr>
-        <w:t>말 한 줄</w:t>
-      </w:r>
-    </w:p>
-    <w:p>
-      <w:pPr>
-        <w:spacing w:before="0" w:after="120" w:line="276" w:lineRule="auto"/>
-        <w:ind w:left="227"/>
-        <w:keepNext w:val="0"/>
-        <w:keepLines/>
-        <w:pBdr>
-          <w:bottom w:val="single" w:sz="6" w:space="4" w:color="9A9A9A"/>
-        </w:pBdr>
-      </w:pPr>
-      <w:r>
-        <w:rPr>
-          <w:sz w:val="20"/>
-        </w:rPr>
-        <w:t xml:space="preserve"> </w:t>
-      </w:r>
-    </w:p>
-    <w:p>
-      <w:pPr>
-        <w:spacing w:before="300" w:after="100" w:line="300" w:lineRule="auto"/>
-        <w:ind w:left="113" w:right="113"/>
-        <w:keepNext/>
-        <w:keepLines/>
-        <w:shd w:val="clear" w:fill="F1F5F9"/>
-      </w:pPr>
-      <w:r>
-        <w:rPr>
-          <w:b/>
-          <w:sz w:val="21"/>
-        </w:rPr>
-        <w:t xml:space="preserve">M8-10  </w:t>
-      </w:r>
-      <w:r>
-        <w:rPr>
-          <w:b/>
-          <w:color w:val="1A1A1A"/>
-          <w:sz w:val="21"/>
-        </w:rPr>
-        <w:t>사용자가 미안함이나 죄책감을 말하면 ("그때 곁에 못 있어서 죄송해요", "더 잘해드릴걸")</w:t>
-      </w:r>
-    </w:p>
-    <w:p>
-      <w:pPr>
-        <w:keepNext/>
-        <w:keepLines/>
-        <w:spacing w:before="0" w:after="80" w:line="312" w:lineRule="auto"/>
-        <w:ind w:left="227"/>
-      </w:pPr>
-      <w:r>
-        <w:rPr>
-          <w:b w:val="0"/>
-          <w:color w:val="1A1A1A"/>
-          <w:sz w:val="20"/>
-        </w:rPr>
-        <w:t>□ 괜찮다고 다독이고 미안해할 것 없다고 한다  □ 네가 해준 것으로 충분했다고 말한다</w:t>
-      </w:r>
-    </w:p>
-    <w:p>
-      <w:pPr>
-        <w:keepNext/>
-        <w:keepLines/>
-        <w:spacing w:before="0" w:after="80" w:line="312" w:lineRule="auto"/>
-        <w:ind w:left="227"/>
-      </w:pPr>
-      <w:r>
-        <w:rPr>
-          <w:b w:val="0"/>
-          <w:color w:val="1A1A1A"/>
-          <w:sz w:val="20"/>
-        </w:rPr>
-        <w:t>□ 그 얘기는 그만하자며 안부로 돌린다  □ 직접 입력 → ____________________</w:t>
-      </w:r>
-    </w:p>
-    <w:p>
-      <w:pPr>
-        <w:keepNext/>
-        <w:keepLines/>
-        <w:spacing w:before="0" w:after="80" w:line="312" w:lineRule="auto"/>
-        <w:ind w:left="227"/>
-      </w:pPr>
-      <w:r>
-        <w:rPr>
-          <w:b w:val="0"/>
-          <w:color w:val="1A1A1A"/>
-          <w:sz w:val="20"/>
-        </w:rPr>
-        <w:t>말 한 줄</w:t>
-      </w:r>
-    </w:p>
-    <w:p>
-      <w:pPr>
-        <w:spacing w:before="0" w:after="120" w:line="276" w:lineRule="auto"/>
-        <w:ind w:left="227"/>
-        <w:keepNext w:val="0"/>
-        <w:keepLines/>
-        <w:pBdr>
-          <w:bottom w:val="single" w:sz="6" w:space="4" w:color="9A9A9A"/>
-        </w:pBdr>
-      </w:pPr>
-      <w:r>
-        <w:rPr>
-          <w:sz w:val="20"/>
-        </w:rPr>
-        <w:t xml:space="preserve"> </w:t>
-      </w:r>
-    </w:p>
-    <w:p>
-      <w:pPr>
-        <w:keepNext w:val="0"/>
         <w:keepLines/>
         <w:spacing w:before="600" w:after="160" w:line="312" w:lineRule="auto"/>
         <w:ind w:left="0"/>
@@ -9639,6 +9967,13 @@
         </w:rPr>
         <w:t>(P1-02에서 "본인"을 고르셨다면) 내가 지정한 금기는 나중에 가족이 요청해도 바뀌지 않습니다. 확인하셨나요?</w:t>
       </w:r>
+      <w:r>
+        <w:rPr>
+          <w:color w:val="6E6E6E"/>
+          <w:sz w:val="17"/>
+        </w:rPr>
+        <w:t xml:space="preserve">   예 / 아니요</w:t>
+      </w:r>
     </w:p>
     <w:p>
       <w:pPr>
@@ -9684,7 +10019,7 @@
           <w:color w:val="6E6E6E"/>
           <w:sz w:val="17"/>
         </w:rPr>
-        <w:t xml:space="preserve">   표</w:t>
+        <w:t xml:space="preserve">   표 0~5행</w:t>
       </w:r>
       <w:r>
         <w:br/>
@@ -9695,7 +10030,7 @@
           <w:color w:val="6E6E6E"/>
           <w:sz w:val="17"/>
         </w:rPr>
-        <w:t>안내: 앞에서 "특정 사람 이야기를 먼저 꺼내기"를 고르셨다면 그 사람이 여기 자동으로 들어옵니다.</w:t>
+        <w:t>가이드: 앞에서 "특정 사람 이야기를 먼저 꺼내기"를 고르셨다면 그 사람이 여기 자동으로 들어옵니다.</w:t>
       </w:r>
     </w:p>
     <w:tbl>
@@ -9856,7 +10191,7 @@
     </w:p>
     <w:p>
       <w:pPr>
-        <w:keepNext w:val="0"/>
+        <w:keepNext/>
         <w:keepLines/>
         <w:spacing w:before="600" w:after="160" w:line="312" w:lineRule="auto"/>
         <w:ind w:left="0"/>
@@ -9891,15 +10226,97 @@
           <w:color w:val="1A1A1A"/>
           <w:sz w:val="21"/>
         </w:rPr>
-        <w:t>그분이 언제 돌아가셨는지, 편하신 만큼만요.</w:t>
+        <w:t>언제 돌아가셨나요?</w:t>
+      </w:r>
+      <w:r>
+        <w:rPr>
+          <w:color w:val="6E6E6E"/>
+          <w:sz w:val="17"/>
+        </w:rPr>
+        <w:t xml:space="preserve">   단답 10자</w:t>
+      </w:r>
+    </w:p>
+    <w:p>
+      <w:pPr>
+        <w:spacing w:before="0" w:after="40" w:line="276" w:lineRule="auto"/>
+        <w:ind w:left="227" w:right="5216"/>
+        <w:keepNext/>
+        <w:keepLines/>
+        <w:pBdr>
+          <w:bottom w:val="single" w:sz="6" w:space="4" w:color="9A9A9A"/>
+        </w:pBdr>
+      </w:pPr>
+      <w:r>
+        <w:rPr>
+          <w:sz w:val="20"/>
+        </w:rPr>
+        <w:t xml:space="preserve"> </w:t>
       </w:r>
     </w:p>
     <w:p>
       <w:pPr>
         <w:keepNext w:val="0"/>
         <w:keepLines/>
+        <w:spacing w:before="0" w:after="140" w:line="312" w:lineRule="auto"/>
+        <w:ind w:left="227"/>
+      </w:pPr>
+      <w:r>
+        <w:rPr>
+          <w:b w:val="0"/>
+          <w:color w:val="6E6E6E"/>
+          <w:sz w:val="18"/>
+        </w:rPr>
+        <w:t>□ 모름  □ 말하지 않음</w:t>
+      </w:r>
+    </w:p>
+    <w:p>
+      <w:pPr>
+        <w:spacing w:before="300" w:after="100" w:line="300" w:lineRule="auto"/>
+        <w:ind w:left="113" w:right="113"/>
+        <w:keepNext/>
+        <w:keepLines/>
+        <w:shd w:val="clear" w:fill="F1F5F9"/>
+      </w:pPr>
+      <w:r>
+        <w:rPr>
+          <w:b/>
+          <w:sz w:val="21"/>
+        </w:rPr>
+        <w:t xml:space="preserve">T1-02  </w:t>
+      </w:r>
+      <w:r>
+        <w:rPr>
+          <w:b/>
+          <w:color w:val="1A1A1A"/>
+          <w:sz w:val="21"/>
+        </w:rPr>
+        <w:t>어떻게 돌아가셨나요?</w:t>
+      </w:r>
+      <w:r>
+        <w:rPr>
+          <w:color w:val="6E6E6E"/>
+          <w:sz w:val="17"/>
+        </w:rPr>
+        <w:t xml:space="preserve">   하나 선택</w:t>
+      </w:r>
+      <w:r>
+        <w:br/>
+      </w:r>
+      <w:r>
+        <w:rPr>
+          <w:b w:val="0"/>
+          <w:color w:val="6E6E6E"/>
+          <w:sz w:val="17"/>
+        </w:rPr>
+        <w:t>가이드: 페르소나가 자기 일을 알고 있어야, 가족이 그때 이야기를 꺼냈을 때 답할 수 있어요. "말하고 싶지 않음"을 고르면 페르소나는 "그 얘기는 하지 말자"로만 답합니다.</w:t>
+      </w:r>
+    </w:p>
+    <w:p>
+      <w:pPr>
+        <w:keepNext/>
+        <w:keepLines/>
         <w:spacing w:before="0" w:after="80" w:line="312" w:lineRule="auto"/>
-        <w:ind w:left="227"/>
+        <w:ind w:left="283"/>
       </w:pPr>
       <w:r>
         <w:rPr>
@@ -9907,7 +10324,71 @@
           <w:color w:val="1A1A1A"/>
           <w:sz w:val="20"/>
         </w:rPr>
-        <w:t>□ 연도 → ______  □ 연도+월 → ______  □ 말하지 않음</w:t>
+        <w:t>□ 오래 투병하시다가</w:t>
+      </w:r>
+    </w:p>
+    <w:p>
+      <w:pPr>
+        <w:keepNext/>
+        <w:keepLines/>
+        <w:spacing w:before="0" w:after="80" w:line="312" w:lineRule="auto"/>
+        <w:ind w:left="283"/>
+      </w:pPr>
+      <w:r>
+        <w:rPr>
+          <w:b w:val="0"/>
+          <w:color w:val="1A1A1A"/>
+          <w:sz w:val="20"/>
+        </w:rPr>
+        <w:t>□ 수술·치료 중에</w:t>
+      </w:r>
+    </w:p>
+    <w:p>
+      <w:pPr>
+        <w:keepNext/>
+        <w:keepLines/>
+        <w:spacing w:before="0" w:after="80" w:line="312" w:lineRule="auto"/>
+        <w:ind w:left="283"/>
+      </w:pPr>
+      <w:r>
+        <w:rPr>
+          <w:b w:val="0"/>
+          <w:color w:val="1A1A1A"/>
+          <w:sz w:val="20"/>
+        </w:rPr>
+        <w:t>□ 갑작스럽게 (사고·급성 질환)</w:t>
+      </w:r>
+    </w:p>
+    <w:p>
+      <w:pPr>
+        <w:keepNext/>
+        <w:keepLines/>
+        <w:spacing w:before="0" w:after="80" w:line="312" w:lineRule="auto"/>
+        <w:ind w:left="283"/>
+      </w:pPr>
+      <w:r>
+        <w:rPr>
+          <w:b w:val="0"/>
+          <w:color w:val="1A1A1A"/>
+          <w:sz w:val="20"/>
+        </w:rPr>
+        <w:t>□ 노환으로 편안하게</w:t>
+      </w:r>
+    </w:p>
+    <w:p>
+      <w:pPr>
+        <w:keepNext w:val="0"/>
+        <w:keepLines/>
+        <w:spacing w:before="0" w:after="80" w:line="312" w:lineRule="auto"/>
+        <w:ind w:left="283"/>
+      </w:pPr>
+      <w:r>
+        <w:rPr>
+          <w:b w:val="0"/>
+          <w:color w:val="1A1A1A"/>
+          <w:sz w:val="20"/>
+        </w:rPr>
+        <w:t>□ 말하고 싶지 않음</w:t>
       </w:r>
     </w:p>
     <w:p>
@@ -9923,7 +10404,7 @@
           <w:b/>
           <w:sz w:val="21"/>
         </w:rPr>
-        <w:t xml:space="preserve">T1-02  </w:t>
+        <w:t xml:space="preserve">T1-03  </w:t>
       </w:r>
       <w:r>
         <w:rPr>
@@ -9931,14 +10412,14 @@
           <w:color w:val="1A1A1A"/>
           <w:sz w:val="21"/>
         </w:rPr>
-        <w:t>어떻게 돌아가셨나요?</w:t>
+        <w:t>마지막 시기에 곁에 있었던 가족과, 있지 못했던 가족은요?</w:t>
       </w:r>
       <w:r>
         <w:rPr>
           <w:color w:val="6E6E6E"/>
           <w:sz w:val="17"/>
         </w:rPr>
-        <w:t xml:space="preserve">   하나 선택</w:t>
+        <w:t xml:space="preserve">   표 0~10행</w:t>
       </w:r>
       <w:r>
         <w:br/>
@@ -9949,129 +10430,7 @@
           <w:color w:val="6E6E6E"/>
           <w:sz w:val="17"/>
         </w:rPr>
-        <w:t>안내: 페르소나가 자기 일을 알고 있어야, 가족이 그때 이야기를 꺼냈을 때 답할 수 있어요. "말하고 싶지 않음"을 고르면 페르소나는 "그 얘기는 하지 말자"로만 답합니다.</w:t>
-      </w:r>
-    </w:p>
-    <w:p>
-      <w:pPr>
-        <w:keepNext/>
-        <w:keepLines/>
-        <w:spacing w:before="0" w:after="80" w:line="312" w:lineRule="auto"/>
-        <w:ind w:left="283"/>
-      </w:pPr>
-      <w:r>
-        <w:rPr>
-          <w:b w:val="0"/>
-          <w:color w:val="1A1A1A"/>
-          <w:sz w:val="20"/>
-        </w:rPr>
-        <w:t>□ 오래 투병하시다가</w:t>
-      </w:r>
-    </w:p>
-    <w:p>
-      <w:pPr>
-        <w:keepNext/>
-        <w:keepLines/>
-        <w:spacing w:before="0" w:after="80" w:line="312" w:lineRule="auto"/>
-        <w:ind w:left="283"/>
-      </w:pPr>
-      <w:r>
-        <w:rPr>
-          <w:b w:val="0"/>
-          <w:color w:val="1A1A1A"/>
-          <w:sz w:val="20"/>
-        </w:rPr>
-        <w:t>□ 수술·치료 중에</w:t>
-      </w:r>
-    </w:p>
-    <w:p>
-      <w:pPr>
-        <w:keepNext/>
-        <w:keepLines/>
-        <w:spacing w:before="0" w:after="80" w:line="312" w:lineRule="auto"/>
-        <w:ind w:left="283"/>
-      </w:pPr>
-      <w:r>
-        <w:rPr>
-          <w:b w:val="0"/>
-          <w:color w:val="1A1A1A"/>
-          <w:sz w:val="20"/>
-        </w:rPr>
-        <w:t>□ 갑작스럽게 (사고·급성 질환)</w:t>
-      </w:r>
-    </w:p>
-    <w:p>
-      <w:pPr>
-        <w:keepNext/>
-        <w:keepLines/>
-        <w:spacing w:before="0" w:after="80" w:line="312" w:lineRule="auto"/>
-        <w:ind w:left="283"/>
-      </w:pPr>
-      <w:r>
-        <w:rPr>
-          <w:b w:val="0"/>
-          <w:color w:val="1A1A1A"/>
-          <w:sz w:val="20"/>
-        </w:rPr>
-        <w:t>□ 노환으로 편안하게</w:t>
-      </w:r>
-    </w:p>
-    <w:p>
-      <w:pPr>
-        <w:keepNext w:val="0"/>
-        <w:keepLines/>
-        <w:spacing w:before="0" w:after="80" w:line="312" w:lineRule="auto"/>
-        <w:ind w:left="283"/>
-      </w:pPr>
-      <w:r>
-        <w:rPr>
-          <w:b w:val="0"/>
-          <w:color w:val="1A1A1A"/>
-          <w:sz w:val="20"/>
-        </w:rPr>
-        <w:t>□ 말하고 싶지 않음</w:t>
-      </w:r>
-    </w:p>
-    <w:p>
-      <w:pPr>
-        <w:spacing w:before="300" w:after="100" w:line="300" w:lineRule="auto"/>
-        <w:ind w:left="113" w:right="113"/>
-        <w:keepNext/>
-        <w:keepLines/>
-        <w:shd w:val="clear" w:fill="F1F5F9"/>
-      </w:pPr>
-      <w:r>
-        <w:rPr>
-          <w:b/>
-          <w:sz w:val="21"/>
-        </w:rPr>
-        <w:t xml:space="preserve">T1-03  </w:t>
-      </w:r>
-      <w:r>
-        <w:rPr>
-          <w:b/>
-          <w:color w:val="1A1A1A"/>
-          <w:sz w:val="21"/>
-        </w:rPr>
-        <w:t>마지막 시기에 곁에 있었던 가족과, 있지 못했던 가족은요?</w:t>
-      </w:r>
-      <w:r>
-        <w:rPr>
-          <w:color w:val="6E6E6E"/>
-          <w:sz w:val="17"/>
-        </w:rPr>
-        <w:t xml:space="preserve">   표 0~10행</w:t>
-      </w:r>
-      <w:r>
-        <w:br/>
-      </w:r>
-      <w:r>
-        <w:rPr>
-          <w:b w:val="0"/>
-          <w:color w:val="6E6E6E"/>
-          <w:sz w:val="17"/>
-        </w:rPr>
-        <w:t>안내: 곁에 못 있던 가족이 미안함을 말하면 페르소나가 그 사실을 알고 받아줍니다.</w:t>
+        <w:t>가이드: 곁에 못 있던 가족이 미안함을 말하면 페르소나가 그 사실을 알고 받아줍니다.</w:t>
       </w:r>
     </w:p>
     <w:tbl>
@@ -10316,7 +10675,7 @@
     </w:p>
     <w:p>
       <w:pPr>
-        <w:keepNext w:val="0"/>
+        <w:keepNext/>
         <w:keepLines/>
         <w:spacing w:before="0" w:after="80" w:line="312" w:lineRule="auto"/>
         <w:ind w:left="227"/>
@@ -10353,10 +10712,17 @@
         </w:rPr>
         <w:t>원본 그대로 듣기 힘든 녹음·영상이 있다면 표시해주세요.</w:t>
       </w:r>
-    </w:p>
-    <w:p>
-      <w:pPr>
-        <w:keepNext w:val="0"/>
+      <w:r>
+        <w:rPr>
+          <w:color w:val="6E6E6E"/>
+          <w:sz w:val="17"/>
+        </w:rPr>
+        <w:t xml:space="preserve">   예 / 아니요</w:t>
+      </w:r>
+    </w:p>
+    <w:p>
+      <w:pPr>
+        <w:keepNext/>
         <w:keepLines/>
         <w:spacing w:before="0" w:after="80" w:line="312" w:lineRule="auto"/>
         <w:ind w:left="227"/>
@@ -10393,6 +10759,13 @@
         </w:rPr>
         <w:t>기일이나 생신에 기억을 꺼내드리는 알림을 원하시나요?</w:t>
       </w:r>
+      <w:r>
+        <w:rPr>
+          <w:color w:val="6E6E6E"/>
+          <w:sz w:val="17"/>
+        </w:rPr>
+        <w:t xml:space="preserve">   하나 선택</w:t>
+      </w:r>
     </w:p>
     <w:p>
       <w:pPr>
@@ -10433,6 +10806,13 @@
         </w:rPr>
         <w:t>핵심 몇 가지만으로 시작해서, 대화하고 답하실수록 그분다워집니다. 준비되셨나요?</w:t>
       </w:r>
+      <w:r>
+        <w:rPr>
+          <w:color w:val="6E6E6E"/>
+          <w:sz w:val="17"/>
+        </w:rPr>
+        <w:t xml:space="preserve">   확인</w:t>
+      </w:r>
     </w:p>
     <w:p>
       <w:pPr>
@@ -10452,7 +10832,7 @@
     </w:p>
     <w:p>
       <w:pPr>
-        <w:keepNext w:val="0"/>
+        <w:keepNext/>
         <w:keepLines/>
         <w:spacing w:before="600" w:after="160" w:line="312" w:lineRule="auto"/>
         <w:ind w:left="0"/>
@@ -10816,7 +11196,7 @@
       <w:pPr>
         <w:spacing w:before="0" w:after="120" w:line="276" w:lineRule="auto"/>
         <w:ind w:left="227"/>
-        <w:keepNext w:val="0"/>
+        <w:keepNext/>
         <w:keepLines/>
         <w:pBdr>
           <w:bottom w:val="single" w:sz="6" w:space="4" w:color="9A9A9A"/>
@@ -10886,10 +11266,17 @@
       <w:r>
         <w:rPr>
           <w:b w:val="0"/>
-          <w:color w:val="1A1A1A"/>
+          <w:color w:val="1F4E79"/>
           <w:sz w:val="20"/>
         </w:rPr>
-        <w:t>이유 (선택, 1~2문장):</w:t>
+        <w:t xml:space="preserve">그렇게 느꼈으면 하는 이유가 있으면 적어주세요.  </w:t>
+      </w:r>
+      <w:r>
+        <w:rPr>
+          <w:color w:val="6E6E6E"/>
+          <w:sz w:val="17"/>
+        </w:rPr>
+        <w:t>서술 1~2문장 · 선택</w:t>
       </w:r>
     </w:p>
     <w:p>
@@ -10932,10 +11319,17 @@
         </w:rPr>
         <w:t>사후 사용 여부는 여기서 정하지 않아요. 별도 동의서에서만 정합니다.</w:t>
       </w:r>
-    </w:p>
-    <w:p>
-      <w:pPr>
-        <w:keepNext w:val="0"/>
+      <w:r>
+        <w:rPr>
+          <w:color w:val="6E6E6E"/>
+          <w:sz w:val="17"/>
+        </w:rPr>
+        <w:t xml:space="preserve">   확인</w:t>
+      </w:r>
+    </w:p>
+    <w:p>
+      <w:pPr>
+        <w:keepNext/>
         <w:keepLines/>
         <w:spacing w:before="0" w:after="80" w:line="312" w:lineRule="auto"/>
         <w:ind w:left="227"/>
@@ -10951,7 +11345,7 @@
     </w:p>
     <w:p>
       <w:pPr>
-        <w:keepNext w:val="0"/>
+        <w:keepNext/>
         <w:keepLines/>
         <w:spacing w:before="600" w:after="160" w:line="312" w:lineRule="auto"/>
         <w:ind w:left="0"/>
@@ -11035,6 +11429,13 @@
         </w:rPr>
         <w:t>그분 본인의 동의 낭독이 필요해요. 링크의 첫 질문으로 보내드릴까요?</w:t>
       </w:r>
+      <w:r>
+        <w:rPr>
+          <w:color w:val="6E6E6E"/>
+          <w:sz w:val="17"/>
+        </w:rPr>
+        <w:t xml:space="preserve">   하나 선택</w:t>
+      </w:r>
     </w:p>
     <w:p>
       <w:pPr>
@@ -11075,6 +11476,13 @@
         </w:rPr>
         <w:t>그분과 보통 얼마나 자주 통화하세요?</w:t>
       </w:r>
+      <w:r>
+        <w:rPr>
+          <w:color w:val="6E6E6E"/>
+          <w:sz w:val="17"/>
+        </w:rPr>
+        <w:t xml:space="preserve">   하나 선택</w:t>
+      </w:r>
     </w:p>
     <w:p>
       <w:pPr>
@@ -11094,7 +11502,7 @@
     </w:p>
     <w:p>
       <w:pPr>
-        <w:keepNext w:val="0"/>
+        <w:keepNext/>
         <w:keepLines/>
         <w:spacing w:before="600" w:after="160" w:line="312" w:lineRule="auto"/>
         <w:ind w:left="0"/>
@@ -11252,6 +11660,96 @@
     </w:p>
     <w:p>
       <w:pPr>
+        <w:spacing w:before="0" w:after="120" w:line="276" w:lineRule="auto"/>
+        <w:ind w:left="227"/>
+        <w:keepNext/>
+        <w:keepLines/>
+        <w:pBdr>
+          <w:bottom w:val="single" w:sz="6" w:space="4" w:color="9A9A9A"/>
+        </w:pBdr>
+      </w:pPr>
+      <w:r>
+        <w:rPr>
+          <w:sz w:val="20"/>
+        </w:rPr>
+        <w:t xml:space="preserve"> </w:t>
+      </w:r>
+    </w:p>
+    <w:p>
+      <w:pPr>
+        <w:spacing w:before="0" w:after="120" w:line="276" w:lineRule="auto"/>
+        <w:ind w:left="227"/>
+        <w:keepNext/>
+        <w:keepLines/>
+        <w:pBdr>
+          <w:bottom w:val="single" w:sz="6" w:space="4" w:color="9A9A9A"/>
+        </w:pBdr>
+      </w:pPr>
+      <w:r>
+        <w:rPr>
+          <w:sz w:val="20"/>
+        </w:rPr>
+        <w:t xml:space="preserve"> </w:t>
+      </w:r>
+    </w:p>
+    <w:p>
+      <w:pPr>
+        <w:keepNext/>
+        <w:keepLines/>
+        <w:spacing w:before="0" w:after="80" w:line="312" w:lineRule="auto"/>
+        <w:ind w:left="227"/>
+      </w:pPr>
+      <w:r>
+        <w:rPr>
+          <w:b w:val="0"/>
+          <w:color w:val="1F4E79"/>
+          <w:sz w:val="20"/>
+        </w:rPr>
+        <w:t xml:space="preserve">누구에게 하는 말인지 적어주세요.  </w:t>
+      </w:r>
+      <w:r>
+        <w:rPr>
+          <w:color w:val="6E6E6E"/>
+          <w:sz w:val="17"/>
+        </w:rPr>
+        <w:t>단답 15자</w:t>
+      </w:r>
+    </w:p>
+    <w:p>
+      <w:pPr>
+        <w:spacing w:before="0" w:after="120" w:line="276" w:lineRule="auto"/>
+        <w:ind w:left="227"/>
+        <w:keepNext/>
+        <w:keepLines/>
+        <w:pBdr>
+          <w:bottom w:val="single" w:sz="6" w:space="4" w:color="9A9A9A"/>
+        </w:pBdr>
+      </w:pPr>
+      <w:r>
+        <w:rPr>
+          <w:sz w:val="20"/>
+        </w:rPr>
+        <w:t xml:space="preserve"> </w:t>
+      </w:r>
+    </w:p>
+    <w:p>
+      <w:pPr>
+        <w:keepNext/>
+        <w:keepLines/>
+        <w:spacing w:before="600" w:after="160" w:line="312" w:lineRule="auto"/>
+        <w:ind w:left="0"/>
+      </w:pPr>
+      <w:r>
+        <w:rPr>
+          <w:b/>
+          <w:color w:val="1F4E79"/>
+          <w:sz w:val="24"/>
+        </w:rPr>
+        <w:t>T5·T6 (치매 진단 가족 / 어린 자녀)</w:t>
+      </w:r>
+    </w:p>
+    <w:p>
+      <w:pPr>
         <w:keepNext/>
         <w:keepLines/>
         <w:spacing w:before="0" w:after="80" w:line="312" w:lineRule="auto"/>
@@ -11263,41 +11761,31 @@
           <w:color w:val="1A1A1A"/>
           <w:sz w:val="20"/>
         </w:rPr>
-        <w:t>받는 사람: ____________</w:t>
-      </w:r>
-    </w:p>
-    <w:p>
-      <w:pPr>
-        <w:spacing w:before="0" w:after="120" w:line="276" w:lineRule="auto"/>
-        <w:ind w:left="227"/>
+        <w:t>법률 검토 전이라 아직 열지 않습니다.</w:t>
+      </w:r>
+    </w:p>
+    <w:p>
+      <w:r>
+        <w:br w:type="page"/>
+      </w:r>
+    </w:p>
+    <w:p>
+      <w:pPr>
+        <w:spacing w:before="0" w:after="180" w:line="312" w:lineRule="auto"/>
+        <w:ind w:left="0"/>
         <w:keepNext/>
         <w:keepLines/>
         <w:pBdr>
-          <w:bottom w:val="single" w:sz="6" w:space="4" w:color="9A9A9A"/>
+          <w:bottom w:val="single" w:sz="12" w:space="4" w:color="1F4E79"/>
         </w:pBdr>
       </w:pPr>
       <w:r>
         <w:rPr>
-          <w:sz w:val="20"/>
-        </w:rPr>
-        <w:t xml:space="preserve"> </w:t>
-      </w:r>
-    </w:p>
-    <w:p>
-      <w:pPr>
-        <w:spacing w:before="0" w:after="120" w:line="276" w:lineRule="auto"/>
-        <w:ind w:left="227"/>
-        <w:keepNext w:val="0"/>
-        <w:keepLines/>
-        <w:pBdr>
-          <w:bottom w:val="single" w:sz="6" w:space="4" w:color="9A9A9A"/>
-        </w:pBdr>
-      </w:pPr>
-      <w:r>
-        <w:rPr>
-          <w:sz w:val="20"/>
-        </w:rPr>
-        <w:t xml:space="preserve"> </w:t>
+          <w:b/>
+          <w:color w:val="1F4E79"/>
+          <w:sz w:val="30"/>
+        </w:rPr>
+        <w:t>PART 5. 검수</w:t>
       </w:r>
     </w:p>
     <w:p>
@@ -11313,12 +11801,12 @@
           <w:color w:val="1F4E79"/>
           <w:sz w:val="24"/>
         </w:rPr>
-        <w:t>T5·T6 (치매 진단 가족 / 어린 자녀)</w:t>
-      </w:r>
-    </w:p>
-    <w:p>
-      <w:pPr>
-        <w:keepNext w:val="0"/>
+        <w:t>본인이 작성한 경우</w:t>
+      </w:r>
+    </w:p>
+    <w:p>
+      <w:pPr>
+        <w:keepNext/>
         <w:keepLines/>
         <w:spacing w:before="0" w:after="80" w:line="312" w:lineRule="auto"/>
         <w:ind w:left="227"/>
@@ -11329,31 +11817,71 @@
           <w:color w:val="1A1A1A"/>
           <w:sz w:val="20"/>
         </w:rPr>
-        <w:t>법률 검토 전이라 아직 열지 않습니다.</w:t>
-      </w:r>
-    </w:p>
-    <w:p>
-      <w:r>
-        <w:br w:type="page"/>
-      </w:r>
-    </w:p>
-    <w:p>
-      <w:pPr>
-        <w:spacing w:before="0" w:after="180" w:line="312" w:lineRule="auto"/>
-        <w:ind w:left="0"/>
+        <w:t>□ 나답게 느껴진다</w:t>
+      </w:r>
+    </w:p>
+    <w:p>
+      <w:pPr>
+        <w:keepNext/>
+        <w:keepLines/>
+        <w:spacing w:before="0" w:after="80" w:line="312" w:lineRule="auto"/>
+        <w:ind w:left="227"/>
+      </w:pPr>
+      <w:r>
+        <w:rPr>
+          <w:b w:val="0"/>
+          <w:color w:val="1A1A1A"/>
+          <w:sz w:val="20"/>
+        </w:rPr>
+        <w:t>□ 내가 안 할 말이 없다</w:t>
+      </w:r>
+    </w:p>
+    <w:p>
+      <w:pPr>
+        <w:keepNext/>
+        <w:keepLines/>
+        <w:spacing w:before="0" w:after="80" w:line="312" w:lineRule="auto"/>
+        <w:ind w:left="227"/>
+      </w:pPr>
+      <w:r>
+        <w:rPr>
+          <w:b w:val="0"/>
+          <w:color w:val="1A1A1A"/>
+          <w:sz w:val="20"/>
+        </w:rPr>
+        <w:t>□ 남기고 싶지 않은 이야기가 들어가지 않았다</w:t>
+      </w:r>
+    </w:p>
+    <w:p>
+      <w:pPr>
+        <w:keepNext/>
+        <w:keepLines/>
+        <w:spacing w:before="0" w:after="80" w:line="312" w:lineRule="auto"/>
+        <w:ind w:left="227"/>
+      </w:pPr>
+      <w:r>
+        <w:rPr>
+          <w:b w:val="0"/>
+          <w:color w:val="1A1A1A"/>
+          <w:sz w:val="20"/>
+        </w:rPr>
+        <w:t>□ 대화 범위(M9-02)가 맞다</w:t>
+      </w:r>
+    </w:p>
+    <w:p>
+      <w:pPr>
         <w:keepNext w:val="0"/>
         <w:keepLines/>
-        <w:pBdr>
-          <w:bottom w:val="single" w:sz="12" w:space="4" w:color="1F4E79"/>
-        </w:pBdr>
-      </w:pPr>
-      <w:r>
-        <w:rPr>
-          <w:b/>
-          <w:color w:val="1F4E79"/>
-          <w:sz w:val="30"/>
-        </w:rPr>
-        <w:t>PART 5. 검수</w:t>
+        <w:spacing w:before="0" w:after="80" w:line="312" w:lineRule="auto"/>
+        <w:ind w:left="227"/>
+      </w:pPr>
+      <w:r>
+        <w:rPr>
+          <w:b w:val="0"/>
+          <w:color w:val="1A1A1A"/>
+          <w:sz w:val="20"/>
+        </w:rPr>
+        <w:t>□ 금지 주제(M9-01)를 지정했다</w:t>
       </w:r>
     </w:p>
     <w:p>
@@ -11369,7 +11897,7 @@
           <w:color w:val="1F4E79"/>
           <w:sz w:val="24"/>
         </w:rPr>
-        <w:t>본인이 작성한 경우</w:t>
+        <w:t>가족이 작성한 경우</w:t>
       </w:r>
     </w:p>
     <w:p>
@@ -11385,7 +11913,7 @@
           <w:color w:val="1A1A1A"/>
           <w:sz w:val="20"/>
         </w:rPr>
-        <w:t>□ 나답게 느껴진다</w:t>
+        <w:t>□ 그분답게 느껴진다</w:t>
       </w:r>
     </w:p>
     <w:p>
@@ -11401,7 +11929,7 @@
           <w:color w:val="1A1A1A"/>
           <w:sz w:val="20"/>
         </w:rPr>
-        <w:t>□ 내가 안 할 말이 없다</w:t>
+        <w:t>□ 호칭·관계에 오류가 없다</w:t>
       </w:r>
     </w:p>
     <w:p>
@@ -11417,7 +11945,7 @@
           <w:color w:val="1A1A1A"/>
           <w:sz w:val="20"/>
         </w:rPr>
-        <w:t>□ 남기고 싶지 않은 이야기가 들어가지 않았다</w:t>
+        <w:t>□ 추정 답변이 실제 발화처럼 쓰이지 않았다</w:t>
       </w:r>
     </w:p>
     <w:p>
@@ -11433,12 +11961,12 @@
           <w:color w:val="1A1A1A"/>
           <w:sz w:val="20"/>
         </w:rPr>
-        <w:t>□ 대화 범위(M9-02)가 맞다</w:t>
-      </w:r>
-    </w:p>
-    <w:p>
-      <w:pPr>
-        <w:keepNext w:val="0"/>
+        <w:t>□ 이 페르소나로 상처받을 가족이 없다</w:t>
+      </w:r>
+    </w:p>
+    <w:p>
+      <w:pPr>
+        <w:keepNext/>
         <w:keepLines/>
         <w:spacing w:before="0" w:after="80" w:line="312" w:lineRule="auto"/>
         <w:ind w:left="227"/>
@@ -11449,23 +11977,7 @@
           <w:color w:val="1A1A1A"/>
           <w:sz w:val="20"/>
         </w:rPr>
-        <w:t>□ 금지 주제(M9-01)를 지정했다</w:t>
-      </w:r>
-    </w:p>
-    <w:p>
-      <w:pPr>
-        <w:keepNext/>
-        <w:keepLines/>
-        <w:spacing w:before="600" w:after="160" w:line="312" w:lineRule="auto"/>
-        <w:ind w:left="0"/>
-      </w:pPr>
-      <w:r>
-        <w:rPr>
-          <w:b/>
-          <w:color w:val="1F4E79"/>
-          <w:sz w:val="24"/>
-        </w:rPr>
-        <w:t>가족이 작성한 경우</w:t>
+        <w:t>□ 모르는 걸 아는 척하지 않는다</w:t>
       </w:r>
     </w:p>
     <w:p>
@@ -11481,12 +11993,12 @@
           <w:color w:val="1A1A1A"/>
           <w:sz w:val="20"/>
         </w:rPr>
-        <w:t>□ 그분답게 느껴진다</w:t>
-      </w:r>
-    </w:p>
-    <w:p>
-      <w:pPr>
-        <w:keepNext/>
+        <w:t>□ 먼저 꺼내면 안 되는 주제가 지정됐다</w:t>
+      </w:r>
+    </w:p>
+    <w:p>
+      <w:pPr>
+        <w:keepNext w:val="0"/>
         <w:keepLines/>
         <w:spacing w:before="0" w:after="80" w:line="312" w:lineRule="auto"/>
         <w:ind w:left="227"/>
@@ -11497,134 +12009,7 @@
           <w:color w:val="1A1A1A"/>
           <w:sz w:val="20"/>
         </w:rPr>
-        <w:t>□ 호칭·관계에 오류가 없다</w:t>
-      </w:r>
-    </w:p>
-    <w:p>
-      <w:pPr>
-        <w:keepNext/>
-        <w:keepLines/>
-        <w:spacing w:before="0" w:after="80" w:line="312" w:lineRule="auto"/>
-        <w:ind w:left="227"/>
-      </w:pPr>
-      <w:r>
-        <w:rPr>
-          <w:b w:val="0"/>
-          <w:color w:val="1A1A1A"/>
-          <w:sz w:val="20"/>
-        </w:rPr>
-        <w:t>□ 추정 답변이 실제 발화처럼 쓰이지 않았다</w:t>
-      </w:r>
-    </w:p>
-    <w:p>
-      <w:pPr>
-        <w:keepNext/>
-        <w:keepLines/>
-        <w:spacing w:before="0" w:after="80" w:line="312" w:lineRule="auto"/>
-        <w:ind w:left="227"/>
-      </w:pPr>
-      <w:r>
-        <w:rPr>
-          <w:b w:val="0"/>
-          <w:color w:val="1A1A1A"/>
-          <w:sz w:val="20"/>
-        </w:rPr>
-        <w:t>□ 이 페르소나로 상처받을 가족이 없다</w:t>
-      </w:r>
-    </w:p>
-    <w:p>
-      <w:pPr>
-        <w:keepNext/>
-        <w:keepLines/>
-        <w:spacing w:before="0" w:after="80" w:line="312" w:lineRule="auto"/>
-        <w:ind w:left="227"/>
-      </w:pPr>
-      <w:r>
-        <w:rPr>
-          <w:b w:val="0"/>
-          <w:color w:val="1A1A1A"/>
-          <w:sz w:val="20"/>
-        </w:rPr>
-        <w:t>□ 모르는 걸 아는 척하지 않는다</w:t>
-      </w:r>
-    </w:p>
-    <w:p>
-      <w:pPr>
-        <w:keepNext/>
-        <w:keepLines/>
-        <w:spacing w:before="0" w:after="80" w:line="312" w:lineRule="auto"/>
-        <w:ind w:left="227"/>
-      </w:pPr>
-      <w:r>
-        <w:rPr>
-          <w:b w:val="0"/>
-          <w:color w:val="1A1A1A"/>
-          <w:sz w:val="20"/>
-        </w:rPr>
-        <w:t>□ 먼저 꺼내면 안 되는 주제가 지정됐다</w:t>
-      </w:r>
-    </w:p>
-    <w:p>
-      <w:pPr>
-        <w:keepNext/>
-        <w:keepLines/>
-        <w:spacing w:before="0" w:after="80" w:line="312" w:lineRule="auto"/>
-        <w:ind w:left="227"/>
-      </w:pPr>
-      <w:r>
-        <w:rPr>
-          <w:b w:val="0"/>
-          <w:color w:val="1A1A1A"/>
-          <w:sz w:val="20"/>
-        </w:rPr>
         <w:t>□ 접근 권한을 가족이 합의했다</w:t>
-      </w:r>
-    </w:p>
-    <w:p>
-      <w:pPr>
-        <w:keepNext/>
-        <w:keepLines/>
-        <w:spacing w:before="0" w:after="80" w:line="312" w:lineRule="auto"/>
-        <w:ind w:left="0"/>
-      </w:pPr>
-      <w:r>
-        <w:rPr>
-          <w:b w:val="0"/>
-          <w:color w:val="6E6E6E"/>
-          <w:sz w:val="18"/>
-        </w:rPr>
-        <w:t>동의서 상태와 결손 목록은 시스템이 기록합니다 (</w:t>
-      </w:r>
-      <w:r>
-        <w:rPr>
-          <w:color w:val="6E6E6E"/>
-          <w:sz w:val="15"/>
-        </w:rPr>
-        <w:t>Persona_Intake_설계규격.md</w:t>
-      </w:r>
-      <w:r>
-        <w:rPr>
-          <w:b w:val="0"/>
-          <w:color w:val="6E6E6E"/>
-          <w:sz w:val="18"/>
-        </w:rPr>
-        <w:t xml:space="preserve"> 참고).</w:t>
-      </w:r>
-    </w:p>
-    <w:p>
-      <w:pPr>
-        <w:keepNext w:val="0"/>
-        <w:keepLines/>
-        <w:spacing w:before="0" w:after="60" w:line="312" w:lineRule="auto"/>
-        <w:ind w:left="340"/>
-      </w:pPr>
-      <w:r>
-        <w:rPr>
-          <w:b w:val="0"/>
-          <w:color w:val="6E6E6E"/>
-          <w:sz w:val="17"/>
-        </w:rPr>
-        <w:t>안내: 돌아가신 분의 페르소나는 가족 검수를 통과해야 완성됩니다.</w:t>
       </w:r>
     </w:p>
     <w:sectPr>

</xml_diff>

<commit_message>
docs(intake): P1-07D 앞에 빈 줄 추가 및 docx 재생성
문항을 끼워 넣을 때 앞의 > 안내줄과 붙어 있어 docx 에서 한 덩어리로 보였다.
</commit_message>
<xml_diff>
--- a/ai/docs/Persona_Intake.docx
+++ b/ai/docs/Persona_Intake.docx
@@ -9566,7 +9566,7 @@
     </w:p>
     <w:p>
       <w:pPr>
-        <w:keepNext/>
+        <w:keepNext w:val="0"/>
         <w:keepLines/>
         <w:spacing w:before="0" w:after="80" w:line="312" w:lineRule="auto"/>
         <w:ind w:left="227"/>
@@ -9668,7 +9668,7 @@
     </w:p>
     <w:p>
       <w:pPr>
-        <w:keepNext/>
+        <w:keepNext w:val="0"/>
         <w:keepLines/>
         <w:spacing w:before="0" w:after="80" w:line="312" w:lineRule="auto"/>
         <w:ind w:left="227"/>

</xml_diff>